<commit_message>
atualiza documentação, pôster e checklist com as correções dos riscos
</commit_message>
<xml_diff>
--- a/docs/Health-In-Sight-Documentacao-Tecnico-Cientifica.docx
+++ b/docs/Health-In-Sight-Documentacao-Tecnico-Cientifica.docx
@@ -2048,7 +2048,7 @@
                 <w:noProof/>
                 <w:webHidden/>
               </w:rPr>
-              <w:t>14</w:t>
+              <w:t>15</w:t>
             </w:r>
             <w:r>
               <w:rPr>
@@ -2121,7 +2121,7 @@
                 <w:noProof/>
                 <w:webHidden/>
               </w:rPr>
-              <w:t>14</w:t>
+              <w:t>15</w:t>
             </w:r>
             <w:r>
               <w:rPr>
@@ -2194,7 +2194,7 @@
                 <w:noProof/>
                 <w:webHidden/>
               </w:rPr>
-              <w:t>14</w:t>
+              <w:t>15</w:t>
             </w:r>
             <w:r>
               <w:rPr>
@@ -2267,7 +2267,7 @@
                 <w:noProof/>
                 <w:webHidden/>
               </w:rPr>
-              <w:t>15</w:t>
+              <w:t>16</w:t>
             </w:r>
             <w:r>
               <w:rPr>
@@ -2413,7 +2413,7 @@
                 <w:noProof/>
                 <w:webHidden/>
               </w:rPr>
-              <w:t>16</w:t>
+              <w:t>17</w:t>
             </w:r>
             <w:r>
               <w:rPr>
@@ -2486,7 +2486,7 @@
                 <w:noProof/>
                 <w:webHidden/>
               </w:rPr>
-              <w:t>16</w:t>
+              <w:t>17</w:t>
             </w:r>
             <w:r>
               <w:rPr>
@@ -2559,7 +2559,7 @@
                 <w:noProof/>
                 <w:webHidden/>
               </w:rPr>
-              <w:t>16</w:t>
+              <w:t>17</w:t>
             </w:r>
             <w:r>
               <w:rPr>
@@ -2632,7 +2632,7 @@
                 <w:noProof/>
                 <w:webHidden/>
               </w:rPr>
-              <w:t>16</w:t>
+              <w:t>17</w:t>
             </w:r>
             <w:r>
               <w:rPr>
@@ -2778,7 +2778,7 @@
                 <w:noProof/>
                 <w:webHidden/>
               </w:rPr>
-              <w:t>17</w:t>
+              <w:t>18</w:t>
             </w:r>
             <w:r>
               <w:rPr>
@@ -2924,7 +2924,7 @@
                 <w:noProof/>
                 <w:webHidden/>
               </w:rPr>
-              <w:t>18</w:t>
+              <w:t>19</w:t>
             </w:r>
             <w:r>
               <w:rPr>
@@ -3070,7 +3070,7 @@
                 <w:noProof/>
                 <w:webHidden/>
               </w:rPr>
-              <w:t>19</w:t>
+              <w:t>20</w:t>
             </w:r>
             <w:r>
               <w:rPr>
@@ -3216,7 +3216,7 @@
                 <w:noProof/>
                 <w:webHidden/>
               </w:rPr>
-              <w:t>20</w:t>
+              <w:t>21</w:t>
             </w:r>
             <w:r>
               <w:rPr>
@@ -3289,7 +3289,7 @@
                 <w:noProof/>
                 <w:webHidden/>
               </w:rPr>
-              <w:t>21</w:t>
+              <w:t>22</w:t>
             </w:r>
             <w:r>
               <w:rPr>
@@ -3508,7 +3508,7 @@
                 <w:noProof/>
                 <w:webHidden/>
               </w:rPr>
-              <w:t>22</w:t>
+              <w:t>23</w:t>
             </w:r>
             <w:r>
               <w:rPr>
@@ -3725,7 +3725,7 @@
                 <w:noProof/>
                 <w:webHidden/>
               </w:rPr>
-              <w:t>23</w:t>
+              <w:t>24</w:t>
             </w:r>
             <w:r>
               <w:rPr>
@@ -7229,7 +7229,7 @@
         <w:tc>
           <w:tcPr>
             <w:cnfStyle w:val="001000000000" w:firstRow="0" w:lastRow="0" w:firstColumn="1" w:lastColumn="0" w:oddVBand="0" w:evenVBand="0" w:oddHBand="0" w:evenHBand="0" w:firstRowFirstColumn="0" w:firstRowLastColumn="0" w:lastRowFirstColumn="0" w:lastRowLastColumn="0"/>
-            <w:tcW w:w="2268" w:type="dxa"/>
+            <w:tcW w:w="1538" w:type="dxa"/>
           </w:tcPr>
           <w:p>
             <w:r>
@@ -7242,7 +7242,7 @@
         </w:tc>
         <w:tc>
           <w:tcPr>
-            <w:tcW w:w="2268" w:type="dxa"/>
+            <w:tcW w:w="1723" w:type="dxa"/>
           </w:tcPr>
           <w:p>
             <w:pPr>
@@ -7258,7 +7258,7 @@
         </w:tc>
         <w:tc>
           <w:tcPr>
-            <w:tcW w:w="2268" w:type="dxa"/>
+            <w:tcW w:w="1785" w:type="dxa"/>
           </w:tcPr>
           <w:p>
             <w:pPr>
@@ -7274,7 +7274,7 @@
         </w:tc>
         <w:tc>
           <w:tcPr>
-            <w:tcW w:w="2268" w:type="dxa"/>
+            <w:tcW w:w="4015" w:type="dxa"/>
           </w:tcPr>
           <w:p>
             <w:pPr>
@@ -7296,7 +7296,7 @@
         <w:tc>
           <w:tcPr>
             <w:cnfStyle w:val="001000000000" w:firstRow="0" w:lastRow="0" w:firstColumn="1" w:lastColumn="0" w:oddVBand="0" w:evenVBand="0" w:oddHBand="0" w:evenHBand="0" w:firstRowFirstColumn="0" w:firstRowLastColumn="0" w:lastRowFirstColumn="0" w:lastRowLastColumn="0"/>
-            <w:tcW w:w="2268" w:type="dxa"/>
+            <w:tcW w:w="1538" w:type="dxa"/>
           </w:tcPr>
           <w:p>
             <w:r>
@@ -7309,7 +7309,7 @@
         </w:tc>
         <w:tc>
           <w:tcPr>
-            <w:tcW w:w="2268" w:type="dxa"/>
+            <w:tcW w:w="1723" w:type="dxa"/>
           </w:tcPr>
           <w:p>
             <w:pPr>
@@ -7325,7 +7325,7 @@
         </w:tc>
         <w:tc>
           <w:tcPr>
-            <w:tcW w:w="2268" w:type="dxa"/>
+            <w:tcW w:w="1785" w:type="dxa"/>
           </w:tcPr>
           <w:p>
             <w:pPr>
@@ -7341,7 +7341,7 @@
         </w:tc>
         <w:tc>
           <w:tcPr>
-            <w:tcW w:w="2268" w:type="dxa"/>
+            <w:tcW w:w="4015" w:type="dxa"/>
           </w:tcPr>
           <w:p>
             <w:pPr>
@@ -7351,7 +7351,7 @@
               <w:rPr>
                 <w:rFonts w:ascii="Times New Roman" w:eastAsia="Times New Roman" w:hAnsi="Times New Roman"/>
               </w:rPr>
-              <w:t>django-axes: bloqueio após 5 tentativas, combinando conta e endereço IP (AXES_LOCKOUT_PARAMETERS).</w:t>
+              <w:t>django-axes: bloqueio após 5 tentativas, combinando conta e endereço IP (AXES_LOCKOUT_PARAMETERS), por 5 minutos no primeiro bloqueio e o dobro a cada repetição no mesmo dia.</w:t>
             </w:r>
           </w:p>
         </w:tc>
@@ -7360,7 +7360,7 @@
         <w:tc>
           <w:tcPr>
             <w:cnfStyle w:val="001000000000" w:firstRow="0" w:lastRow="0" w:firstColumn="1" w:lastColumn="0" w:oddVBand="0" w:evenVBand="0" w:oddHBand="0" w:evenHBand="0" w:firstRowFirstColumn="0" w:firstRowLastColumn="0" w:lastRowFirstColumn="0" w:lastRowLastColumn="0"/>
-            <w:tcW w:w="2268" w:type="dxa"/>
+            <w:tcW w:w="1538" w:type="dxa"/>
           </w:tcPr>
           <w:p>
             <w:r>
@@ -7373,7 +7373,7 @@
         </w:tc>
         <w:tc>
           <w:tcPr>
-            <w:tcW w:w="2268" w:type="dxa"/>
+            <w:tcW w:w="1723" w:type="dxa"/>
           </w:tcPr>
           <w:p>
             <w:pPr>
@@ -7383,13 +7383,13 @@
               <w:rPr>
                 <w:rFonts w:ascii="Times New Roman" w:eastAsia="Times New Roman" w:hAnsi="Times New Roman"/>
               </w:rPr>
-              <w:t>Invasor com a senha de um membro da equipe entra no painel /admin/, que não pede o segundo fator (R01)</w:t>
-            </w:r>
-          </w:p>
-        </w:tc>
-        <w:tc>
-          <w:tcPr>
-            <w:tcW w:w="2268" w:type="dxa"/>
+              <w:t>Invasor com a senha de um membro da equipe tenta entrar no painel /admin/ sem o segundo fator (R01)</w:t>
+            </w:r>
+          </w:p>
+        </w:tc>
+        <w:tc>
+          <w:tcPr>
+            <w:tcW w:w="1785" w:type="dxa"/>
           </w:tcPr>
           <w:p>
             <w:pPr>
@@ -7405,7 +7405,7 @@
         </w:tc>
         <w:tc>
           <w:tcPr>
-            <w:tcW w:w="2268" w:type="dxa"/>
+            <w:tcW w:w="4015" w:type="dxa"/>
           </w:tcPr>
           <w:p>
             <w:pPr>
@@ -7415,7 +7415,7 @@
               <w:rPr>
                 <w:rFonts w:ascii="Times New Roman" w:eastAsia="Times New Roman" w:hAnsi="Times New Roman"/>
               </w:rPr>
-              <w:t>Planejada: trocar o admin.site pelo OTPAdminSite (django-otp) e exigir dispositivo 2FA confirmado das contas da equipe.</w:t>
+              <w:t>O admin.site é um OTPAdminSite (django-otp): o painel só abre para a equipe depois do código TOTP confirmado na sessão. Conta da equipe sem 2FA não entra no site, e o cadastro de dispositivos 2FA saiu do painel.</w:t>
             </w:r>
           </w:p>
         </w:tc>
@@ -7427,7 +7427,7 @@
         <w:tc>
           <w:tcPr>
             <w:cnfStyle w:val="001000000000" w:firstRow="0" w:lastRow="0" w:firstColumn="1" w:lastColumn="0" w:oddVBand="0" w:evenVBand="0" w:oddHBand="0" w:evenHBand="0" w:firstRowFirstColumn="0" w:firstRowLastColumn="0" w:lastRowFirstColumn="0" w:lastRowLastColumn="0"/>
-            <w:tcW w:w="2268" w:type="dxa"/>
+            <w:tcW w:w="1538" w:type="dxa"/>
           </w:tcPr>
           <w:p>
             <w:r>
@@ -7440,7 +7440,7 @@
         </w:tc>
         <w:tc>
           <w:tcPr>
-            <w:tcW w:w="2268" w:type="dxa"/>
+            <w:tcW w:w="1723" w:type="dxa"/>
           </w:tcPr>
           <w:p>
             <w:pPr>
@@ -7456,7 +7456,7 @@
         </w:tc>
         <w:tc>
           <w:tcPr>
-            <w:tcW w:w="2268" w:type="dxa"/>
+            <w:tcW w:w="1785" w:type="dxa"/>
           </w:tcPr>
           <w:p>
             <w:pPr>
@@ -7472,7 +7472,7 @@
         </w:tc>
         <w:tc>
           <w:tcPr>
-            <w:tcW w:w="2268" w:type="dxa"/>
+            <w:tcW w:w="4015" w:type="dxa"/>
           </w:tcPr>
           <w:p>
             <w:pPr>
@@ -7482,7 +7482,7 @@
               <w:rPr>
                 <w:rFonts w:ascii="Times New Roman" w:eastAsia="Times New Roman" w:hAnsi="Times New Roman"/>
               </w:rPr>
-              <w:t>Atual: bloqueio após 5 falhas por conta e IP. Planejada: limite por IP e global (django-ratelimit) e bloqueio progressivo.</w:t>
+              <w:t>Limite de envios por IP e no total no login (django-ratelimit), além do bloqueio por conta e IP do django-axes, que passou a ser progressivo.</w:t>
             </w:r>
           </w:p>
         </w:tc>
@@ -7491,62 +7491,76 @@
         <w:tc>
           <w:tcPr>
             <w:cnfStyle w:val="001000000000" w:firstRow="0" w:lastRow="0" w:firstColumn="1" w:lastColumn="0" w:oddVBand="0" w:evenVBand="0" w:oddHBand="0" w:evenHBand="0" w:firstRowFirstColumn="0" w:firstRowLastColumn="0" w:lastRowFirstColumn="0" w:lastRowLastColumn="0"/>
-            <w:tcW w:w="2268" w:type="dxa"/>
-          </w:tcPr>
-          <w:p>
-            <w:r>
+            <w:tcW w:w="1538" w:type="dxa"/>
+          </w:tcPr>
+          <w:p>
+            <w:pPr>
               <w:rPr>
                 <w:rFonts w:ascii="Times New Roman" w:eastAsia="Times New Roman" w:hAnsi="Times New Roman"/>
               </w:rPr>
-              <w:t>Tampering</w:t>
-            </w:r>
-          </w:p>
-        </w:tc>
-        <w:tc>
-          <w:tcPr>
-            <w:tcW w:w="2268" w:type="dxa"/>
+            </w:pPr>
+            <w:r>
+              <w:rPr>
+                <w:rFonts w:ascii="Times New Roman" w:eastAsia="Times New Roman" w:hAnsi="Times New Roman"/>
+              </w:rPr>
+              <w:t>Spoofing</w:t>
+            </w:r>
+          </w:p>
+        </w:tc>
+        <w:tc>
+          <w:tcPr>
+            <w:tcW w:w="1723" w:type="dxa"/>
           </w:tcPr>
           <w:p>
             <w:pPr>
               <w:cnfStyle w:val="000000000000" w:firstRow="0" w:lastRow="0" w:firstColumn="0" w:lastColumn="0" w:oddVBand="0" w:evenVBand="0" w:oddHBand="0" w:evenHBand="0" w:firstRowFirstColumn="0" w:firstRowLastColumn="0" w:lastRowFirstColumn="0" w:lastRowLastColumn="0"/>
+              <w:rPr>
+                <w:rFonts w:ascii="Times New Roman" w:eastAsia="Times New Roman" w:hAnsi="Times New Roman"/>
+              </w:rPr>
             </w:pPr>
             <w:r>
               <w:rPr>
                 <w:rFonts w:ascii="Times New Roman" w:eastAsia="Times New Roman" w:hAnsi="Times New Roman"/>
               </w:rPr>
-              <w:t>Alteração retroativa de um registro da trilha de auditoria</w:t>
-            </w:r>
-          </w:p>
-        </w:tc>
-        <w:tc>
-          <w:tcPr>
-            <w:tcW w:w="2268" w:type="dxa"/>
+              <w:t>Quem encontra uma sessão aberta desliga o 2FA ou testa senhas na tela de exclusão da conta (R12)</w:t>
+            </w:r>
+          </w:p>
+        </w:tc>
+        <w:tc>
+          <w:tcPr>
+            <w:tcW w:w="1785" w:type="dxa"/>
           </w:tcPr>
           <w:p>
             <w:pPr>
               <w:cnfStyle w:val="000000000000" w:firstRow="0" w:lastRow="0" w:firstColumn="0" w:lastColumn="0" w:oddVBand="0" w:evenVBand="0" w:oddHBand="0" w:evenHBand="0" w:firstRowFirstColumn="0" w:firstRowLastColumn="0" w:lastRowFirstColumn="0" w:lastRowLastColumn="0"/>
+              <w:rPr>
+                <w:rFonts w:ascii="Times New Roman" w:eastAsia="Times New Roman" w:hAnsi="Times New Roman"/>
+              </w:rPr>
             </w:pPr>
             <w:r>
               <w:rPr>
                 <w:rFonts w:ascii="Times New Roman" w:eastAsia="Times New Roman" w:hAnsi="Times New Roman"/>
               </w:rPr>
-              <w:t>Trilha de auditoria</w:t>
-            </w:r>
-          </w:p>
-        </w:tc>
-        <w:tc>
-          <w:tcPr>
-            <w:tcW w:w="2268" w:type="dxa"/>
+              <w:t>Conta do usuário, segundo fator</w:t>
+            </w:r>
+          </w:p>
+        </w:tc>
+        <w:tc>
+          <w:tcPr>
+            <w:tcW w:w="4015" w:type="dxa"/>
           </w:tcPr>
           <w:p>
             <w:pPr>
               <w:cnfStyle w:val="000000000000" w:firstRow="0" w:lastRow="0" w:firstColumn="0" w:lastColumn="0" w:oddVBand="0" w:evenVBand="0" w:oddHBand="0" w:evenHBand="0" w:firstRowFirstColumn="0" w:firstRowLastColumn="0" w:lastRowFirstColumn="0" w:lastRowLastColumn="0"/>
+              <w:rPr>
+                <w:rFonts w:ascii="Times New Roman" w:eastAsia="Times New Roman" w:hAnsi="Times New Roman"/>
+              </w:rPr>
             </w:pPr>
             <w:r>
               <w:rPr>
                 <w:rFonts w:ascii="Times New Roman" w:eastAsia="Times New Roman" w:hAnsi="Times New Roman"/>
               </w:rPr>
-              <w:t>Encadeamento por hash: cada evento grava o hash do evento anterior; qualquer alteração quebra a cadeia, detectável pelo comando verificar_logs.</w:t>
+              <w:t>Desativar o 2FA pede a senha e um código. A exclusão da conta e a desativação do 2FA bloqueiam depois de 5 confirmações erradas em 15 minutos.</w:t>
             </w:r>
           </w:p>
         </w:tc>
@@ -7558,20 +7572,20 @@
         <w:tc>
           <w:tcPr>
             <w:cnfStyle w:val="001000000000" w:firstRow="0" w:lastRow="0" w:firstColumn="1" w:lastColumn="0" w:oddVBand="0" w:evenVBand="0" w:oddHBand="0" w:evenHBand="0" w:firstRowFirstColumn="0" w:firstRowLastColumn="0" w:lastRowFirstColumn="0" w:lastRowLastColumn="0"/>
-            <w:tcW w:w="2268" w:type="dxa"/>
+            <w:tcW w:w="1538" w:type="dxa"/>
           </w:tcPr>
           <w:p>
             <w:r>
               <w:rPr>
                 <w:rFonts w:ascii="Times New Roman" w:eastAsia="Times New Roman" w:hAnsi="Times New Roman"/>
               </w:rPr>
-              <w:t>Repudiation</w:t>
-            </w:r>
-          </w:p>
-        </w:tc>
-        <w:tc>
-          <w:tcPr>
-            <w:tcW w:w="2268" w:type="dxa"/>
+              <w:t>Tampering</w:t>
+            </w:r>
+          </w:p>
+        </w:tc>
+        <w:tc>
+          <w:tcPr>
+            <w:tcW w:w="1723" w:type="dxa"/>
           </w:tcPr>
           <w:p>
             <w:pPr>
@@ -7581,13 +7595,13 @@
               <w:rPr>
                 <w:rFonts w:ascii="Times New Roman" w:eastAsia="Times New Roman" w:hAnsi="Times New Roman"/>
               </w:rPr>
-              <w:t>Usuário negar ter realizado login, tentativa de acesso ou exclusão de conta</w:t>
-            </w:r>
-          </w:p>
-        </w:tc>
-        <w:tc>
-          <w:tcPr>
-            <w:tcW w:w="2268" w:type="dxa"/>
+              <w:t>Alteração retroativa de um registro da trilha de auditoria</w:t>
+            </w:r>
+          </w:p>
+        </w:tc>
+        <w:tc>
+          <w:tcPr>
+            <w:tcW w:w="1785" w:type="dxa"/>
           </w:tcPr>
           <w:p>
             <w:pPr>
@@ -7603,7 +7617,7 @@
         </w:tc>
         <w:tc>
           <w:tcPr>
-            <w:tcW w:w="2268" w:type="dxa"/>
+            <w:tcW w:w="4015" w:type="dxa"/>
           </w:tcPr>
           <w:p>
             <w:pPr>
@@ -7613,7 +7627,7 @@
               <w:rPr>
                 <w:rFonts w:ascii="Times New Roman" w:eastAsia="Times New Roman" w:hAnsi="Times New Roman"/>
               </w:rPr>
-              <w:t>Registro de IP de origem, data/hora e tipo de evento para cada evento de autenticação, capturado via signals do Django — inclusive eventos disparados pelo painel administrativo.</w:t>
+              <w:t>Encadeamento por hash: cada evento grava o hash do evento anterior; qualquer alteração quebra a cadeia, detectável pelo comando verificar_logs.</w:t>
             </w:r>
           </w:p>
         </w:tc>
@@ -7622,20 +7636,20 @@
         <w:tc>
           <w:tcPr>
             <w:cnfStyle w:val="001000000000" w:firstRow="0" w:lastRow="0" w:firstColumn="1" w:lastColumn="0" w:oddVBand="0" w:evenVBand="0" w:oddHBand="0" w:evenHBand="0" w:firstRowFirstColumn="0" w:firstRowLastColumn="0" w:lastRowFirstColumn="0" w:lastRowLastColumn="0"/>
-            <w:tcW w:w="2268" w:type="dxa"/>
+            <w:tcW w:w="1538" w:type="dxa"/>
           </w:tcPr>
           <w:p>
             <w:r>
               <w:rPr>
                 <w:rFonts w:ascii="Times New Roman" w:eastAsia="Times New Roman" w:hAnsi="Times New Roman"/>
               </w:rPr>
-              <w:t>Information Disclosure</w:t>
-            </w:r>
-          </w:p>
-        </w:tc>
-        <w:tc>
-          <w:tcPr>
-            <w:tcW w:w="2268" w:type="dxa"/>
+              <w:t>Repudiation</w:t>
+            </w:r>
+          </w:p>
+        </w:tc>
+        <w:tc>
+          <w:tcPr>
+            <w:tcW w:w="1723" w:type="dxa"/>
           </w:tcPr>
           <w:p>
             <w:pPr>
@@ -7645,13 +7659,13 @@
               <w:rPr>
                 <w:rFonts w:ascii="Times New Roman" w:eastAsia="Times New Roman" w:hAnsi="Times New Roman"/>
               </w:rPr>
-              <w:t>Extração do banco de dados expondo senhas ou segredos de 2FA</w:t>
-            </w:r>
-          </w:p>
-        </w:tc>
-        <w:tc>
-          <w:tcPr>
-            <w:tcW w:w="2268" w:type="dxa"/>
+              <w:t>Usuário negar ter realizado login, tentativa de acesso ou exclusão de conta</w:t>
+            </w:r>
+          </w:p>
+        </w:tc>
+        <w:tc>
+          <w:tcPr>
+            <w:tcW w:w="1785" w:type="dxa"/>
           </w:tcPr>
           <w:p>
             <w:pPr>
@@ -7661,13 +7675,13 @@
               <w:rPr>
                 <w:rFonts w:ascii="Times New Roman" w:eastAsia="Times New Roman" w:hAnsi="Times New Roman"/>
               </w:rPr>
-              <w:t>Hash de senha, segredo TOTP</w:t>
-            </w:r>
-          </w:p>
-        </w:tc>
-        <w:tc>
-          <w:tcPr>
-            <w:tcW w:w="2268" w:type="dxa"/>
+              <w:t>Trilha de auditoria</w:t>
+            </w:r>
+          </w:p>
+        </w:tc>
+        <w:tc>
+          <w:tcPr>
+            <w:tcW w:w="4015" w:type="dxa"/>
           </w:tcPr>
           <w:p>
             <w:pPr>
@@ -7677,7 +7691,7 @@
               <w:rPr>
                 <w:rFonts w:ascii="Times New Roman" w:eastAsia="Times New Roman" w:hAnsi="Times New Roman"/>
               </w:rPr>
-              <w:t>Senha armazenada apenas como hash Argon2id (irreversível); segredo do TOTP cifrado em repouso.</w:t>
+              <w:t>Registro de IP de origem, data/hora e tipo de evento para cada evento de autenticação, capturado via signals do Django — inclusive eventos disparados pelo painel administrativo.</w:t>
             </w:r>
           </w:p>
         </w:tc>
@@ -7689,20 +7703,20 @@
         <w:tc>
           <w:tcPr>
             <w:cnfStyle w:val="001000000000" w:firstRow="0" w:lastRow="0" w:firstColumn="1" w:lastColumn="0" w:oddVBand="0" w:evenVBand="0" w:oddHBand="0" w:evenHBand="0" w:firstRowFirstColumn="0" w:firstRowLastColumn="0" w:lastRowFirstColumn="0" w:lastRowLastColumn="0"/>
-            <w:tcW w:w="2268" w:type="dxa"/>
+            <w:tcW w:w="1538" w:type="dxa"/>
           </w:tcPr>
           <w:p>
             <w:r>
               <w:rPr>
                 <w:rFonts w:ascii="Times New Roman" w:eastAsia="Times New Roman" w:hAnsi="Times New Roman"/>
               </w:rPr>
-              <w:t>Denial of Service</w:t>
-            </w:r>
-          </w:p>
-        </w:tc>
-        <w:tc>
-          <w:tcPr>
-            <w:tcW w:w="2268" w:type="dxa"/>
+              <w:t>Information Disclosure</w:t>
+            </w:r>
+          </w:p>
+        </w:tc>
+        <w:tc>
+          <w:tcPr>
+            <w:tcW w:w="1723" w:type="dxa"/>
           </w:tcPr>
           <w:p>
             <w:pPr>
@@ -7712,13 +7726,13 @@
               <w:rPr>
                 <w:rFonts w:ascii="Times New Roman" w:eastAsia="Times New Roman" w:hAnsi="Times New Roman"/>
               </w:rPr>
-              <w:t>Sobrecarga do endpoint de login com tentativas repetidas</w:t>
-            </w:r>
-          </w:p>
-        </w:tc>
-        <w:tc>
-          <w:tcPr>
-            <w:tcW w:w="2268" w:type="dxa"/>
+              <w:t>Extração do banco de dados expondo senhas ou segredos de 2FA</w:t>
+            </w:r>
+          </w:p>
+        </w:tc>
+        <w:tc>
+          <w:tcPr>
+            <w:tcW w:w="1785" w:type="dxa"/>
           </w:tcPr>
           <w:p>
             <w:pPr>
@@ -7728,13 +7742,13 @@
               <w:rPr>
                 <w:rFonts w:ascii="Times New Roman" w:eastAsia="Times New Roman" w:hAnsi="Times New Roman"/>
               </w:rPr>
-              <w:t>Disponibilidade do serviço de autenticação</w:t>
-            </w:r>
-          </w:p>
-        </w:tc>
-        <w:tc>
-          <w:tcPr>
-            <w:tcW w:w="2268" w:type="dxa"/>
+              <w:t>Hash de senha, segredo TOTP</w:t>
+            </w:r>
+          </w:p>
+        </w:tc>
+        <w:tc>
+          <w:tcPr>
+            <w:tcW w:w="4015" w:type="dxa"/>
           </w:tcPr>
           <w:p>
             <w:pPr>
@@ -7744,7 +7758,7 @@
               <w:rPr>
                 <w:rFonts w:ascii="Times New Roman" w:eastAsia="Times New Roman" w:hAnsi="Times New Roman"/>
               </w:rPr>
-              <w:t>O mesmo mecanismo de bloqueio do django-axes limita a taxa efetiva de tentativas por conta e por IP.</w:t>
+              <w:t>Senha armazenada apenas como hash Argon2id (irreversível); segredo do TOTP cifrado em repouso.</w:t>
             </w:r>
           </w:p>
         </w:tc>
@@ -7753,62 +7767,76 @@
         <w:tc>
           <w:tcPr>
             <w:cnfStyle w:val="001000000000" w:firstRow="0" w:lastRow="0" w:firstColumn="1" w:lastColumn="0" w:oddVBand="0" w:evenVBand="0" w:oddHBand="0" w:evenHBand="0" w:firstRowFirstColumn="0" w:firstRowLastColumn="0" w:lastRowFirstColumn="0" w:lastRowLastColumn="0"/>
-            <w:tcW w:w="2268" w:type="dxa"/>
-          </w:tcPr>
-          <w:p>
-            <w:r>
+            <w:tcW w:w="1538" w:type="dxa"/>
+          </w:tcPr>
+          <w:p>
+            <w:pPr>
               <w:rPr>
                 <w:rFonts w:ascii="Times New Roman" w:eastAsia="Times New Roman" w:hAnsi="Times New Roman"/>
               </w:rPr>
-              <w:t>Denial of Service</w:t>
-            </w:r>
-          </w:p>
-        </w:tc>
-        <w:tc>
-          <w:tcPr>
-            <w:tcW w:w="2268" w:type="dxa"/>
+            </w:pPr>
+            <w:r>
+              <w:rPr>
+                <w:rFonts w:ascii="Times New Roman" w:eastAsia="Times New Roman" w:hAnsi="Times New Roman"/>
+              </w:rPr>
+              <w:t>Information Disclosure</w:t>
+            </w:r>
+          </w:p>
+        </w:tc>
+        <w:tc>
+          <w:tcPr>
+            <w:tcW w:w="1723" w:type="dxa"/>
           </w:tcPr>
           <w:p>
             <w:pPr>
               <w:cnfStyle w:val="000000000000" w:firstRow="0" w:lastRow="0" w:firstColumn="0" w:lastColumn="0" w:oddVBand="0" w:evenVBand="0" w:oddHBand="0" w:evenHBand="0" w:firstRowFirstColumn="0" w:firstRowLastColumn="0" w:lastRowFirstColumn="0" w:lastRowLastColumn="0"/>
+              <w:rPr>
+                <w:rFonts w:ascii="Times New Roman" w:eastAsia="Times New Roman" w:hAnsi="Times New Roman"/>
+              </w:rPr>
             </w:pPr>
             <w:r>
               <w:rPr>
                 <w:rFonts w:ascii="Times New Roman" w:eastAsia="Times New Roman" w:hAnsi="Times New Roman"/>
               </w:rPr>
-              <w:t>Esgotamento de memória: muitos logins simultâneos com e-mails aleatórios, cada um calculando um Argon2id de 64 MiB no único worker (R03)</w:t>
-            </w:r>
-          </w:p>
-        </w:tc>
-        <w:tc>
-          <w:tcPr>
-            <w:tcW w:w="2268" w:type="dxa"/>
+              <w:t>Descobrir se um e-mail tem conta pela resposta do cadastro (R08)</w:t>
+            </w:r>
+          </w:p>
+        </w:tc>
+        <w:tc>
+          <w:tcPr>
+            <w:tcW w:w="1785" w:type="dxa"/>
           </w:tcPr>
           <w:p>
             <w:pPr>
               <w:cnfStyle w:val="000000000000" w:firstRow="0" w:lastRow="0" w:firstColumn="0" w:lastColumn="0" w:oddVBand="0" w:evenVBand="0" w:oddHBand="0" w:evenHBand="0" w:firstRowFirstColumn="0" w:firstRowLastColumn="0" w:lastRowFirstColumn="0" w:lastRowLastColumn="0"/>
+              <w:rPr>
+                <w:rFonts w:ascii="Times New Roman" w:eastAsia="Times New Roman" w:hAnsi="Times New Roman"/>
+              </w:rPr>
             </w:pPr>
             <w:r>
               <w:rPr>
                 <w:rFonts w:ascii="Times New Roman" w:eastAsia="Times New Roman" w:hAnsi="Times New Roman"/>
               </w:rPr>
-              <w:t>Disponibilidade da autenticação</w:t>
-            </w:r>
-          </w:p>
-        </w:tc>
-        <w:tc>
-          <w:tcPr>
-            <w:tcW w:w="2268" w:type="dxa"/>
+              <w:t>Contas de usuário</w:t>
+            </w:r>
+          </w:p>
+        </w:tc>
+        <w:tc>
+          <w:tcPr>
+            <w:tcW w:w="4015" w:type="dxa"/>
           </w:tcPr>
           <w:p>
             <w:pPr>
               <w:cnfStyle w:val="000000000000" w:firstRow="0" w:lastRow="0" w:firstColumn="0" w:lastColumn="0" w:oddVBand="0" w:evenVBand="0" w:oddHBand="0" w:evenHBand="0" w:firstRowFirstColumn="0" w:firstRowLastColumn="0" w:lastRowFirstColumn="0" w:lastRowLastColumn="0"/>
+              <w:rPr>
+                <w:rFonts w:ascii="Times New Roman" w:eastAsia="Times New Roman" w:hAnsi="Times New Roman"/>
+              </w:rPr>
             </w:pPr>
             <w:r>
               <w:rPr>
                 <w:rFonts w:ascii="Times New Roman" w:eastAsia="Times New Roman" w:hAnsi="Times New Roman"/>
               </w:rPr>
-              <w:t>Planejada: limite de requisições por IP e global no login, cadastro e recuperação de senha, e mais workers no Gunicorn.</w:t>
+              <w:t>O cadastro responde igual para e-mail novo ou já cadastrado. A conta só é ativada pelo link enviado ao e-mail, e o dono do endereço recebe aviso da tentativa.</w:t>
             </w:r>
           </w:p>
         </w:tc>
@@ -7820,20 +7848,165 @@
         <w:tc>
           <w:tcPr>
             <w:cnfStyle w:val="001000000000" w:firstRow="0" w:lastRow="0" w:firstColumn="1" w:lastColumn="0" w:oddVBand="0" w:evenVBand="0" w:oddHBand="0" w:evenHBand="0" w:firstRowFirstColumn="0" w:firstRowLastColumn="0" w:lastRowFirstColumn="0" w:lastRowLastColumn="0"/>
-            <w:tcW w:w="2268" w:type="dxa"/>
-          </w:tcPr>
-          <w:p>
-            <w:r>
+            <w:tcW w:w="1538" w:type="dxa"/>
+          </w:tcPr>
+          <w:p>
+            <w:pPr>
               <w:rPr>
                 <w:rFonts w:ascii="Times New Roman" w:eastAsia="Times New Roman" w:hAnsi="Times New Roman"/>
               </w:rPr>
-              <w:t>Elevation of Privilege</w:t>
-            </w:r>
-          </w:p>
-        </w:tc>
-        <w:tc>
-          <w:tcPr>
-            <w:tcW w:w="2268" w:type="dxa"/>
+            </w:pPr>
+            <w:r>
+              <w:rPr>
+                <w:rFonts w:ascii="Times New Roman" w:eastAsia="Times New Roman" w:hAnsi="Times New Roman"/>
+              </w:rPr>
+              <w:t>Information Disclosure</w:t>
+            </w:r>
+          </w:p>
+        </w:tc>
+        <w:tc>
+          <w:tcPr>
+            <w:tcW w:w="1723" w:type="dxa"/>
+          </w:tcPr>
+          <w:p>
+            <w:pPr>
+              <w:cnfStyle w:val="000000100000" w:firstRow="0" w:lastRow="0" w:firstColumn="0" w:lastColumn="0" w:oddVBand="0" w:evenVBand="0" w:oddHBand="1" w:evenHBand="0" w:firstRowFirstColumn="0" w:firstRowLastColumn="0" w:lastRowFirstColumn="0" w:lastRowLastColumn="0"/>
+              <w:rPr>
+                <w:rFonts w:ascii="Times New Roman" w:eastAsia="Times New Roman" w:hAnsi="Times New Roman"/>
+              </w:rPr>
+            </w:pPr>
+            <w:r>
+              <w:rPr>
+                <w:rFonts w:ascii="Times New Roman" w:eastAsia="Times New Roman" w:hAnsi="Times New Roman"/>
+              </w:rPr>
+              <w:t>Token de recuperação de senha vazando pelo histórico do navegador ou pelo cabeçalho Referer (R13)</w:t>
+            </w:r>
+          </w:p>
+        </w:tc>
+        <w:tc>
+          <w:tcPr>
+            <w:tcW w:w="1785" w:type="dxa"/>
+          </w:tcPr>
+          <w:p>
+            <w:pPr>
+              <w:cnfStyle w:val="000000100000" w:firstRow="0" w:lastRow="0" w:firstColumn="0" w:lastColumn="0" w:oddVBand="0" w:evenVBand="0" w:oddHBand="1" w:evenHBand="0" w:firstRowFirstColumn="0" w:firstRowLastColumn="0" w:lastRowFirstColumn="0" w:lastRowLastColumn="0"/>
+              <w:rPr>
+                <w:rFonts w:ascii="Times New Roman" w:eastAsia="Times New Roman" w:hAnsi="Times New Roman"/>
+              </w:rPr>
+            </w:pPr>
+            <w:r>
+              <w:rPr>
+                <w:rFonts w:ascii="Times New Roman" w:eastAsia="Times New Roman" w:hAnsi="Times New Roman"/>
+              </w:rPr>
+              <w:t>Conta do usuário</w:t>
+            </w:r>
+          </w:p>
+        </w:tc>
+        <w:tc>
+          <w:tcPr>
+            <w:tcW w:w="4015" w:type="dxa"/>
+          </w:tcPr>
+          <w:p>
+            <w:pPr>
+              <w:cnfStyle w:val="000000100000" w:firstRow="0" w:lastRow="0" w:firstColumn="0" w:lastColumn="0" w:oddVBand="0" w:evenVBand="0" w:oddHBand="1" w:evenHBand="0" w:firstRowFirstColumn="0" w:firstRowLastColumn="0" w:lastRowFirstColumn="0" w:lastRowLastColumn="0"/>
+              <w:rPr>
+                <w:rFonts w:ascii="Times New Roman" w:eastAsia="Times New Roman" w:hAnsi="Times New Roman"/>
+              </w:rPr>
+            </w:pPr>
+            <w:r>
+              <w:rPr>
+                <w:rFonts w:ascii="Times New Roman" w:eastAsia="Times New Roman" w:hAnsi="Times New Roman"/>
+              </w:rPr>
+              <w:t>O link só confere o token e redireciona para um endereço sem ele; a sessão guarda apenas o identificador do registro.</w:t>
+            </w:r>
+          </w:p>
+        </w:tc>
+      </w:tr>
+      <w:tr>
+        <w:tc>
+          <w:tcPr>
+            <w:cnfStyle w:val="001000000000" w:firstRow="0" w:lastRow="0" w:firstColumn="1" w:lastColumn="0" w:oddVBand="0" w:evenVBand="0" w:oddHBand="0" w:evenHBand="0" w:firstRowFirstColumn="0" w:firstRowLastColumn="0" w:lastRowFirstColumn="0" w:lastRowLastColumn="0"/>
+            <w:tcW w:w="1538" w:type="dxa"/>
+          </w:tcPr>
+          <w:p>
+            <w:r>
+              <w:rPr>
+                <w:rFonts w:ascii="Times New Roman" w:eastAsia="Times New Roman" w:hAnsi="Times New Roman"/>
+              </w:rPr>
+              <w:t>Denial of Service</w:t>
+            </w:r>
+          </w:p>
+        </w:tc>
+        <w:tc>
+          <w:tcPr>
+            <w:tcW w:w="1723" w:type="dxa"/>
+          </w:tcPr>
+          <w:p>
+            <w:pPr>
+              <w:cnfStyle w:val="000000000000" w:firstRow="0" w:lastRow="0" w:firstColumn="0" w:lastColumn="0" w:oddVBand="0" w:evenVBand="0" w:oddHBand="0" w:evenHBand="0" w:firstRowFirstColumn="0" w:firstRowLastColumn="0" w:lastRowFirstColumn="0" w:lastRowLastColumn="0"/>
+            </w:pPr>
+            <w:r>
+              <w:rPr>
+                <w:rFonts w:ascii="Times New Roman" w:eastAsia="Times New Roman" w:hAnsi="Times New Roman"/>
+              </w:rPr>
+              <w:t>Sobrecarga do endpoint de login com tentativas repetidas</w:t>
+            </w:r>
+          </w:p>
+        </w:tc>
+        <w:tc>
+          <w:tcPr>
+            <w:tcW w:w="1785" w:type="dxa"/>
+          </w:tcPr>
+          <w:p>
+            <w:pPr>
+              <w:cnfStyle w:val="000000000000" w:firstRow="0" w:lastRow="0" w:firstColumn="0" w:lastColumn="0" w:oddVBand="0" w:evenVBand="0" w:oddHBand="0" w:evenHBand="0" w:firstRowFirstColumn="0" w:firstRowLastColumn="0" w:lastRowFirstColumn="0" w:lastRowLastColumn="0"/>
+            </w:pPr>
+            <w:r>
+              <w:rPr>
+                <w:rFonts w:ascii="Times New Roman" w:eastAsia="Times New Roman" w:hAnsi="Times New Roman"/>
+              </w:rPr>
+              <w:t>Disponibilidade do serviço de autenticação</w:t>
+            </w:r>
+          </w:p>
+        </w:tc>
+        <w:tc>
+          <w:tcPr>
+            <w:tcW w:w="4015" w:type="dxa"/>
+          </w:tcPr>
+          <w:p>
+            <w:pPr>
+              <w:cnfStyle w:val="000000000000" w:firstRow="0" w:lastRow="0" w:firstColumn="0" w:lastColumn="0" w:oddVBand="0" w:evenVBand="0" w:oddHBand="0" w:evenHBand="0" w:firstRowFirstColumn="0" w:firstRowLastColumn="0" w:lastRowFirstColumn="0" w:lastRowLastColumn="0"/>
+            </w:pPr>
+            <w:r>
+              <w:rPr>
+                <w:rFonts w:ascii="Times New Roman" w:eastAsia="Times New Roman" w:hAnsi="Times New Roman"/>
+              </w:rPr>
+              <w:t>Limite de envios por IP e no total no login, na verificação do código, no cadastro e na recuperação de senha (resposta 429), somado ao bloqueio do django-axes.</w:t>
+            </w:r>
+          </w:p>
+        </w:tc>
+      </w:tr>
+      <w:tr>
+        <w:trPr>
+          <w:cnfStyle w:val="000000100000" w:firstRow="0" w:lastRow="0" w:firstColumn="0" w:lastColumn="0" w:oddVBand="0" w:evenVBand="0" w:oddHBand="1" w:evenHBand="0" w:firstRowFirstColumn="0" w:firstRowLastColumn="0" w:lastRowFirstColumn="0" w:lastRowLastColumn="0"/>
+        </w:trPr>
+        <w:tc>
+          <w:tcPr>
+            <w:cnfStyle w:val="001000000000" w:firstRow="0" w:lastRow="0" w:firstColumn="1" w:lastColumn="0" w:oddVBand="0" w:evenVBand="0" w:oddHBand="0" w:evenHBand="0" w:firstRowFirstColumn="0" w:firstRowLastColumn="0" w:lastRowFirstColumn="0" w:lastRowLastColumn="0"/>
+            <w:tcW w:w="1538" w:type="dxa"/>
+          </w:tcPr>
+          <w:p>
+            <w:r>
+              <w:rPr>
+                <w:rFonts w:ascii="Times New Roman" w:eastAsia="Times New Roman" w:hAnsi="Times New Roman"/>
+              </w:rPr>
+              <w:t>Denial of Service</w:t>
+            </w:r>
+          </w:p>
+        </w:tc>
+        <w:tc>
+          <w:tcPr>
+            <w:tcW w:w="1723" w:type="dxa"/>
           </w:tcPr>
           <w:p>
             <w:pPr>
@@ -7843,13 +8016,13 @@
               <w:rPr>
                 <w:rFonts w:ascii="Times New Roman" w:eastAsia="Times New Roman" w:hAnsi="Times New Roman"/>
               </w:rPr>
-              <w:t>Usuário comum tentando acessar rotas administrativas ou dados de outro titular</w:t>
-            </w:r>
-          </w:p>
-        </w:tc>
-        <w:tc>
-          <w:tcPr>
-            <w:tcW w:w="2268" w:type="dxa"/>
+              <w:t>Esgotamento de memória: muitos logins simultâneos com e-mails aleatórios, cada um calculando um Argon2id de 64 MiB no único worker (R03)</w:t>
+            </w:r>
+          </w:p>
+        </w:tc>
+        <w:tc>
+          <w:tcPr>
+            <w:tcW w:w="1785" w:type="dxa"/>
           </w:tcPr>
           <w:p>
             <w:pPr>
@@ -7859,13 +8032,13 @@
               <w:rPr>
                 <w:rFonts w:ascii="Times New Roman" w:eastAsia="Times New Roman" w:hAnsi="Times New Roman"/>
               </w:rPr>
-              <w:t>Painel administrativo, dados de outros usuários</w:t>
-            </w:r>
-          </w:p>
-        </w:tc>
-        <w:tc>
-          <w:tcPr>
-            <w:tcW w:w="2268" w:type="dxa"/>
+              <w:t>Disponibilidade da autenticação</w:t>
+            </w:r>
+          </w:p>
+        </w:tc>
+        <w:tc>
+          <w:tcPr>
+            <w:tcW w:w="4015" w:type="dxa"/>
           </w:tcPr>
           <w:p>
             <w:pPr>
@@ -7875,6 +8048,70 @@
               <w:rPr>
                 <w:rFonts w:ascii="Times New Roman" w:eastAsia="Times New Roman" w:hAnsi="Times New Roman"/>
               </w:rPr>
+              <w:t>Os mesmos limites por IP e no total reduzem quantos Argon2id são calculados ao mesmo tempo. Falta subir 2 workers no Gunicorn (WEB_CONCURRENCY no Render).</w:t>
+            </w:r>
+          </w:p>
+        </w:tc>
+      </w:tr>
+      <w:tr>
+        <w:tc>
+          <w:tcPr>
+            <w:cnfStyle w:val="001000000000" w:firstRow="0" w:lastRow="0" w:firstColumn="1" w:lastColumn="0" w:oddVBand="0" w:evenVBand="0" w:oddHBand="0" w:evenHBand="0" w:firstRowFirstColumn="0" w:firstRowLastColumn="0" w:lastRowFirstColumn="0" w:lastRowLastColumn="0"/>
+            <w:tcW w:w="1538" w:type="dxa"/>
+          </w:tcPr>
+          <w:p>
+            <w:r>
+              <w:rPr>
+                <w:rFonts w:ascii="Times New Roman" w:eastAsia="Times New Roman" w:hAnsi="Times New Roman"/>
+              </w:rPr>
+              <w:t>Elevation of Privilege</w:t>
+            </w:r>
+          </w:p>
+        </w:tc>
+        <w:tc>
+          <w:tcPr>
+            <w:tcW w:w="1723" w:type="dxa"/>
+          </w:tcPr>
+          <w:p>
+            <w:pPr>
+              <w:cnfStyle w:val="000000000000" w:firstRow="0" w:lastRow="0" w:firstColumn="0" w:lastColumn="0" w:oddVBand="0" w:evenVBand="0" w:oddHBand="0" w:evenHBand="0" w:firstRowFirstColumn="0" w:firstRowLastColumn="0" w:lastRowFirstColumn="0" w:lastRowLastColumn="0"/>
+            </w:pPr>
+            <w:r>
+              <w:rPr>
+                <w:rFonts w:ascii="Times New Roman" w:eastAsia="Times New Roman" w:hAnsi="Times New Roman"/>
+              </w:rPr>
+              <w:t>Usuário comum tentando acessar rotas administrativas ou dados de outro titular</w:t>
+            </w:r>
+          </w:p>
+        </w:tc>
+        <w:tc>
+          <w:tcPr>
+            <w:tcW w:w="1785" w:type="dxa"/>
+          </w:tcPr>
+          <w:p>
+            <w:pPr>
+              <w:cnfStyle w:val="000000000000" w:firstRow="0" w:lastRow="0" w:firstColumn="0" w:lastColumn="0" w:oddVBand="0" w:evenVBand="0" w:oddHBand="0" w:evenHBand="0" w:firstRowFirstColumn="0" w:firstRowLastColumn="0" w:lastRowFirstColumn="0" w:lastRowLastColumn="0"/>
+            </w:pPr>
+            <w:r>
+              <w:rPr>
+                <w:rFonts w:ascii="Times New Roman" w:eastAsia="Times New Roman" w:hAnsi="Times New Roman"/>
+              </w:rPr>
+              <w:t>Painel administrativo, dados de outros usuários</w:t>
+            </w:r>
+          </w:p>
+        </w:tc>
+        <w:tc>
+          <w:tcPr>
+            <w:tcW w:w="4015" w:type="dxa"/>
+          </w:tcPr>
+          <w:p>
+            <w:pPr>
+              <w:cnfStyle w:val="000000000000" w:firstRow="0" w:lastRow="0" w:firstColumn="0" w:lastColumn="0" w:oddVBand="0" w:evenVBand="0" w:oddHBand="0" w:evenHBand="0" w:firstRowFirstColumn="0" w:firstRowLastColumn="0" w:lastRowFirstColumn="0" w:lastRowLastColumn="0"/>
+            </w:pPr>
+            <w:r>
+              <w:rPr>
+                <w:rFonts w:ascii="Times New Roman" w:eastAsia="Times New Roman" w:hAnsi="Times New Roman"/>
+              </w:rPr>
               <w:t>Checagem de permissão de administrador em toda view administrativa; nenhum perfil tem permissão para alterar ou excluir registros da trilha de auditoria.</w:t>
             </w:r>
           </w:p>
@@ -7905,23 +8142,30 @@
         <w:rPr>
           <w:rFonts w:ascii="Times New Roman" w:eastAsia="Times New Roman" w:hAnsi="Times New Roman" w:cs="Times New Roman"/>
         </w:rPr>
-        <w:t>A matriz a seguir classifica os 15 riscos identificados na avaliação de segurança do repositório por probabilidade e impacto. O nível é o produto das duas notas: probabilidade Baixa (1), Média (2) ou Alta (3) vezes impacto Baixo (1), Médio (2), Alto (3) ou Severo (4); até 2 é Baixo, de 3 a 4 Médio, de 6 a 8 Alto e 9 ou mais Crítico. Os pilares são confidencialidade (C), integridade (I) e disponibilidade (D).</w:t>
+        <w:t xml:space="preserve">A matriz a seguir classifica os 15 riscos identificados na avaliação de segurança do repositório por probabilidade e impacto. O nível é o produto das duas notas: probabilidade Baixa (1), Média (2) ou Alta (3) vezes impacto Baixo (1), Médio (2), Alto (3) ou Severo (4); até 2 é Baixo, de 3 a 4 Médio, de 6 a 8 Alto e 9 ou mais Crítico. </w:t>
+      </w:r>
+      <w:r>
+        <w:rPr>
+          <w:rFonts w:ascii="Times New Roman" w:eastAsia="Times New Roman" w:hAnsi="Times New Roman" w:cs="Times New Roman"/>
+        </w:rPr>
+        <w:t>Os pilares são confidencialidade (C), integridade (I) e disponibilidade (D). A última coluna mostra a situação de cada risco depois das correções de outubro de 2026.</w:t>
       </w:r>
     </w:p>
     <w:tbl>
       <w:tblPr>
         <w:tblStyle w:val="SimplesTabela1"/>
-        <w:tblW w:w="0" w:type="auto"/>
+        <w:tblW w:w="9240" w:type="dxa"/>
         <w:tblLayout w:type="fixed"/>
         <w:tblLook w:val="04A0" w:firstRow="1" w:lastRow="0" w:firstColumn="1" w:lastColumn="0" w:noHBand="0" w:noVBand="1"/>
       </w:tblPr>
       <w:tblGrid>
         <w:gridCol w:w="737"/>
-        <w:gridCol w:w="4025"/>
+        <w:gridCol w:w="2745"/>
         <w:gridCol w:w="907"/>
         <w:gridCol w:w="1587"/>
         <w:gridCol w:w="1077"/>
         <w:gridCol w:w="907"/>
+        <w:gridCol w:w="1280"/>
       </w:tblGrid>
       <w:tr>
         <w:trPr>
@@ -7944,7 +8188,7 @@
         </w:tc>
         <w:tc>
           <w:tcPr>
-            <w:tcW w:w="4025" w:type="dxa"/>
+            <w:tcW w:w="2745" w:type="dxa"/>
           </w:tcPr>
           <w:p>
             <w:pPr>
@@ -8024,6 +8268,27 @@
                 <w:sz w:val="20"/>
               </w:rPr>
               <w:t>Nível</w:t>
+            </w:r>
+          </w:p>
+        </w:tc>
+        <w:tc>
+          <w:tcPr>
+            <w:tcW w:w="1280" w:type="dxa"/>
+          </w:tcPr>
+          <w:p>
+            <w:pPr>
+              <w:cnfStyle w:val="100000000000" w:firstRow="1" w:lastRow="0" w:firstColumn="0" w:lastColumn="0" w:oddVBand="0" w:evenVBand="0" w:oddHBand="0" w:evenHBand="0" w:firstRowFirstColumn="0" w:firstRowLastColumn="0" w:lastRowFirstColumn="0" w:lastRowLastColumn="0"/>
+              <w:rPr>
+                <w:rFonts w:ascii="Times New Roman" w:hAnsi="Times New Roman"/>
+                <w:sz w:val="20"/>
+              </w:rPr>
+            </w:pPr>
+            <w:r>
+              <w:rPr>
+                <w:rFonts w:ascii="Times New Roman" w:hAnsi="Times New Roman"/>
+                <w:sz w:val="20"/>
+              </w:rPr>
+              <w:t>Situação</w:t>
             </w:r>
           </w:p>
         </w:tc>
@@ -8049,7 +8314,7 @@
         </w:tc>
         <w:tc>
           <w:tcPr>
-            <w:tcW w:w="4025" w:type="dxa"/>
+            <w:tcW w:w="2745" w:type="dxa"/>
           </w:tcPr>
           <w:p>
             <w:pPr>
@@ -8132,14 +8397,37 @@
             </w:r>
           </w:p>
         </w:tc>
+        <w:tc>
+          <w:tcPr>
+            <w:tcW w:w="1280" w:type="dxa"/>
+          </w:tcPr>
+          <w:p>
+            <w:pPr>
+              <w:cnfStyle w:val="000000100000" w:firstRow="0" w:lastRow="0" w:firstColumn="0" w:lastColumn="0" w:oddVBand="0" w:evenVBand="0" w:oddHBand="1" w:evenHBand="0" w:firstRowFirstColumn="0" w:firstRowLastColumn="0" w:lastRowFirstColumn="0" w:lastRowLastColumn="0"/>
+              <w:rPr>
+                <w:rFonts w:ascii="Times New Roman" w:hAnsi="Times New Roman"/>
+                <w:sz w:val="20"/>
+              </w:rPr>
+            </w:pPr>
+            <w:r>
+              <w:rPr>
+                <w:rFonts w:ascii="Times New Roman" w:hAnsi="Times New Roman"/>
+                <w:sz w:val="20"/>
+              </w:rPr>
+              <w:t>Corrigido</w:t>
+            </w:r>
+          </w:p>
+        </w:tc>
       </w:tr>
       <w:tr>
         <w:tc>
           <w:tcPr>
-            <w:cnfStyle w:val="001000000000" w:firstRow="0" w:lastRow="0" w:firstColumn="1" w:lastColumn="0" w:oddVBand="0" w:evenVBand="0" w:oddHBand="0" w:evenHBand="0" w:firstRowFirstColumn="0" w:firstRowLastColumn="0" w:lastRowFirstColumn="0" w:lastRowLastColumn="0"/>
             <w:tcW w:w="737" w:type="dxa"/>
           </w:tcPr>
           <w:p>
+            <w:pPr>
+              <w:cnfStyle w:val="001000000000" w:firstRow="0" w:lastRow="0" w:firstColumn="1" w:lastColumn="0" w:oddVBand="0" w:evenVBand="0" w:oddHBand="0" w:evenHBand="0" w:firstRowFirstColumn="0" w:firstRowLastColumn="0" w:lastRowFirstColumn="0" w:lastRowLastColumn="0"/>
+            </w:pPr>
             <w:r>
               <w:rPr>
                 <w:rFonts w:ascii="Times New Roman" w:hAnsi="Times New Roman"/>
@@ -8151,12 +8439,9 @@
         </w:tc>
         <w:tc>
           <w:tcPr>
-            <w:tcW w:w="4025" w:type="dxa"/>
-          </w:tcPr>
-          <w:p>
-            <w:pPr>
-              <w:cnfStyle w:val="000000000000" w:firstRow="0" w:lastRow="0" w:firstColumn="0" w:lastColumn="0" w:oddVBand="0" w:evenVBand="0" w:oddHBand="0" w:evenHBand="0" w:firstRowFirstColumn="0" w:firstRowLastColumn="0" w:lastRowFirstColumn="0" w:lastRowLastColumn="0"/>
-            </w:pPr>
+            <w:tcW w:w="2745" w:type="dxa"/>
+          </w:tcPr>
+          <w:p>
             <w:r>
               <w:rPr>
                 <w:rFonts w:ascii="Times New Roman" w:hAnsi="Times New Roman"/>
@@ -8171,9 +8456,6 @@
             <w:tcW w:w="907" w:type="dxa"/>
           </w:tcPr>
           <w:p>
-            <w:pPr>
-              <w:cnfStyle w:val="000000000000" w:firstRow="0" w:lastRow="0" w:firstColumn="0" w:lastColumn="0" w:oddVBand="0" w:evenVBand="0" w:oddHBand="0" w:evenHBand="0" w:firstRowFirstColumn="0" w:firstRowLastColumn="0" w:lastRowFirstColumn="0" w:lastRowLastColumn="0"/>
-            </w:pPr>
             <w:r>
               <w:rPr>
                 <w:rFonts w:ascii="Times New Roman" w:hAnsi="Times New Roman"/>
@@ -8188,9 +8470,6 @@
             <w:tcW w:w="1587" w:type="dxa"/>
           </w:tcPr>
           <w:p>
-            <w:pPr>
-              <w:cnfStyle w:val="000000000000" w:firstRow="0" w:lastRow="0" w:firstColumn="0" w:lastColumn="0" w:oddVBand="0" w:evenVBand="0" w:oddHBand="0" w:evenHBand="0" w:firstRowFirstColumn="0" w:firstRowLastColumn="0" w:lastRowFirstColumn="0" w:lastRowLastColumn="0"/>
-            </w:pPr>
             <w:r>
               <w:rPr>
                 <w:rFonts w:ascii="Times New Roman" w:hAnsi="Times New Roman"/>
@@ -8205,9 +8484,6 @@
             <w:tcW w:w="1077" w:type="dxa"/>
           </w:tcPr>
           <w:p>
-            <w:pPr>
-              <w:cnfStyle w:val="000000000000" w:firstRow="0" w:lastRow="0" w:firstColumn="0" w:lastColumn="0" w:oddVBand="0" w:evenVBand="0" w:oddHBand="0" w:evenHBand="0" w:firstRowFirstColumn="0" w:firstRowLastColumn="0" w:lastRowFirstColumn="0" w:lastRowLastColumn="0"/>
-            </w:pPr>
             <w:r>
               <w:rPr>
                 <w:rFonts w:ascii="Times New Roman" w:hAnsi="Times New Roman"/>
@@ -8222,15 +8498,32 @@
             <w:tcW w:w="907" w:type="dxa"/>
           </w:tcPr>
           <w:p>
-            <w:pPr>
-              <w:cnfStyle w:val="000000000000" w:firstRow="0" w:lastRow="0" w:firstColumn="0" w:lastColumn="0" w:oddVBand="0" w:evenVBand="0" w:oddHBand="0" w:evenHBand="0" w:firstRowFirstColumn="0" w:firstRowLastColumn="0" w:lastRowFirstColumn="0" w:lastRowLastColumn="0"/>
-            </w:pPr>
             <w:r>
               <w:rPr>
                 <w:rFonts w:ascii="Times New Roman" w:hAnsi="Times New Roman"/>
                 <w:sz w:val="20"/>
               </w:rPr>
               <w:t>Alto</w:t>
+            </w:r>
+          </w:p>
+        </w:tc>
+        <w:tc>
+          <w:tcPr>
+            <w:tcW w:w="1280" w:type="dxa"/>
+          </w:tcPr>
+          <w:p>
+            <w:pPr>
+              <w:rPr>
+                <w:rFonts w:ascii="Times New Roman" w:hAnsi="Times New Roman"/>
+                <w:sz w:val="20"/>
+              </w:rPr>
+            </w:pPr>
+            <w:r>
+              <w:rPr>
+                <w:rFonts w:ascii="Times New Roman" w:hAnsi="Times New Roman"/>
+                <w:sz w:val="20"/>
+              </w:rPr>
+              <w:t>Em aberto</w:t>
             </w:r>
           </w:p>
         </w:tc>
@@ -8256,7 +8549,7 @@
         </w:tc>
         <w:tc>
           <w:tcPr>
-            <w:tcW w:w="4025" w:type="dxa"/>
+            <w:tcW w:w="2745" w:type="dxa"/>
           </w:tcPr>
           <w:p>
             <w:pPr>
@@ -8339,14 +8632,37 @@
             </w:r>
           </w:p>
         </w:tc>
+        <w:tc>
+          <w:tcPr>
+            <w:tcW w:w="1280" w:type="dxa"/>
+          </w:tcPr>
+          <w:p>
+            <w:pPr>
+              <w:cnfStyle w:val="000000100000" w:firstRow="0" w:lastRow="0" w:firstColumn="0" w:lastColumn="0" w:oddVBand="0" w:evenVBand="0" w:oddHBand="1" w:evenHBand="0" w:firstRowFirstColumn="0" w:firstRowLastColumn="0" w:lastRowFirstColumn="0" w:lastRowLastColumn="0"/>
+              <w:rPr>
+                <w:rFonts w:ascii="Times New Roman" w:hAnsi="Times New Roman"/>
+                <w:sz w:val="20"/>
+              </w:rPr>
+            </w:pPr>
+            <w:r>
+              <w:rPr>
+                <w:rFonts w:ascii="Times New Roman" w:hAnsi="Times New Roman"/>
+                <w:sz w:val="20"/>
+              </w:rPr>
+              <w:t>Parcial</w:t>
+            </w:r>
+          </w:p>
+        </w:tc>
       </w:tr>
       <w:tr>
         <w:tc>
           <w:tcPr>
-            <w:cnfStyle w:val="001000000000" w:firstRow="0" w:lastRow="0" w:firstColumn="1" w:lastColumn="0" w:oddVBand="0" w:evenVBand="0" w:oddHBand="0" w:evenHBand="0" w:firstRowFirstColumn="0" w:firstRowLastColumn="0" w:lastRowFirstColumn="0" w:lastRowLastColumn="0"/>
             <w:tcW w:w="737" w:type="dxa"/>
           </w:tcPr>
           <w:p>
+            <w:pPr>
+              <w:cnfStyle w:val="001000000000" w:firstRow="0" w:lastRow="0" w:firstColumn="1" w:lastColumn="0" w:oddVBand="0" w:evenVBand="0" w:oddHBand="0" w:evenHBand="0" w:firstRowFirstColumn="0" w:firstRowLastColumn="0" w:lastRowFirstColumn="0" w:lastRowLastColumn="0"/>
+            </w:pPr>
             <w:r>
               <w:rPr>
                 <w:rFonts w:ascii="Times New Roman" w:hAnsi="Times New Roman"/>
@@ -8358,12 +8674,9 @@
         </w:tc>
         <w:tc>
           <w:tcPr>
-            <w:tcW w:w="4025" w:type="dxa"/>
-          </w:tcPr>
-          <w:p>
-            <w:pPr>
-              <w:cnfStyle w:val="000000000000" w:firstRow="0" w:lastRow="0" w:firstColumn="0" w:lastColumn="0" w:oddVBand="0" w:evenVBand="0" w:oddHBand="0" w:evenHBand="0" w:firstRowFirstColumn="0" w:firstRowLastColumn="0" w:lastRowFirstColumn="0" w:lastRowLastColumn="0"/>
-            </w:pPr>
+            <w:tcW w:w="2745" w:type="dxa"/>
+          </w:tcPr>
+          <w:p>
             <w:r>
               <w:rPr>
                 <w:rFonts w:ascii="Times New Roman" w:hAnsi="Times New Roman"/>
@@ -8378,9 +8691,6 @@
             <w:tcW w:w="907" w:type="dxa"/>
           </w:tcPr>
           <w:p>
-            <w:pPr>
-              <w:cnfStyle w:val="000000000000" w:firstRow="0" w:lastRow="0" w:firstColumn="0" w:lastColumn="0" w:oddVBand="0" w:evenVBand="0" w:oddHBand="0" w:evenHBand="0" w:firstRowFirstColumn="0" w:firstRowLastColumn="0" w:lastRowFirstColumn="0" w:lastRowLastColumn="0"/>
-            </w:pPr>
             <w:r>
               <w:rPr>
                 <w:rFonts w:ascii="Times New Roman" w:hAnsi="Times New Roman"/>
@@ -8395,9 +8705,6 @@
             <w:tcW w:w="1587" w:type="dxa"/>
           </w:tcPr>
           <w:p>
-            <w:pPr>
-              <w:cnfStyle w:val="000000000000" w:firstRow="0" w:lastRow="0" w:firstColumn="0" w:lastColumn="0" w:oddVBand="0" w:evenVBand="0" w:oddHBand="0" w:evenHBand="0" w:firstRowFirstColumn="0" w:firstRowLastColumn="0" w:lastRowFirstColumn="0" w:lastRowLastColumn="0"/>
-            </w:pPr>
             <w:r>
               <w:rPr>
                 <w:rFonts w:ascii="Times New Roman" w:hAnsi="Times New Roman"/>
@@ -8412,9 +8719,6 @@
             <w:tcW w:w="1077" w:type="dxa"/>
           </w:tcPr>
           <w:p>
-            <w:pPr>
-              <w:cnfStyle w:val="000000000000" w:firstRow="0" w:lastRow="0" w:firstColumn="0" w:lastColumn="0" w:oddVBand="0" w:evenVBand="0" w:oddHBand="0" w:evenHBand="0" w:firstRowFirstColumn="0" w:firstRowLastColumn="0" w:lastRowFirstColumn="0" w:lastRowLastColumn="0"/>
-            </w:pPr>
             <w:r>
               <w:rPr>
                 <w:rFonts w:ascii="Times New Roman" w:hAnsi="Times New Roman"/>
@@ -8429,15 +8733,32 @@
             <w:tcW w:w="907" w:type="dxa"/>
           </w:tcPr>
           <w:p>
-            <w:pPr>
-              <w:cnfStyle w:val="000000000000" w:firstRow="0" w:lastRow="0" w:firstColumn="0" w:lastColumn="0" w:oddVBand="0" w:evenVBand="0" w:oddHBand="0" w:evenHBand="0" w:firstRowFirstColumn="0" w:firstRowLastColumn="0" w:lastRowFirstColumn="0" w:lastRowLastColumn="0"/>
-            </w:pPr>
             <w:r>
               <w:rPr>
                 <w:rFonts w:ascii="Times New Roman" w:hAnsi="Times New Roman"/>
                 <w:sz w:val="20"/>
               </w:rPr>
               <w:t>Alto</w:t>
+            </w:r>
+          </w:p>
+        </w:tc>
+        <w:tc>
+          <w:tcPr>
+            <w:tcW w:w="1280" w:type="dxa"/>
+          </w:tcPr>
+          <w:p>
+            <w:pPr>
+              <w:rPr>
+                <w:rFonts w:ascii="Times New Roman" w:hAnsi="Times New Roman"/>
+                <w:sz w:val="20"/>
+              </w:rPr>
+            </w:pPr>
+            <w:r>
+              <w:rPr>
+                <w:rFonts w:ascii="Times New Roman" w:hAnsi="Times New Roman"/>
+                <w:sz w:val="20"/>
+              </w:rPr>
+              <w:t>Em aberto</w:t>
             </w:r>
           </w:p>
         </w:tc>
@@ -8463,7 +8784,7 @@
         </w:tc>
         <w:tc>
           <w:tcPr>
-            <w:tcW w:w="4025" w:type="dxa"/>
+            <w:tcW w:w="2745" w:type="dxa"/>
           </w:tcPr>
           <w:p>
             <w:pPr>
@@ -8546,14 +8867,37 @@
             </w:r>
           </w:p>
         </w:tc>
+        <w:tc>
+          <w:tcPr>
+            <w:tcW w:w="1280" w:type="dxa"/>
+          </w:tcPr>
+          <w:p>
+            <w:pPr>
+              <w:cnfStyle w:val="000000100000" w:firstRow="0" w:lastRow="0" w:firstColumn="0" w:lastColumn="0" w:oddVBand="0" w:evenVBand="0" w:oddHBand="1" w:evenHBand="0" w:firstRowFirstColumn="0" w:firstRowLastColumn="0" w:lastRowFirstColumn="0" w:lastRowLastColumn="0"/>
+              <w:rPr>
+                <w:rFonts w:ascii="Times New Roman" w:hAnsi="Times New Roman"/>
+                <w:sz w:val="20"/>
+              </w:rPr>
+            </w:pPr>
+            <w:r>
+              <w:rPr>
+                <w:rFonts w:ascii="Times New Roman" w:hAnsi="Times New Roman"/>
+                <w:sz w:val="20"/>
+              </w:rPr>
+              <w:t>Corrigido</w:t>
+            </w:r>
+          </w:p>
+        </w:tc>
       </w:tr>
       <w:tr>
         <w:tc>
           <w:tcPr>
-            <w:cnfStyle w:val="001000000000" w:firstRow="0" w:lastRow="0" w:firstColumn="1" w:lastColumn="0" w:oddVBand="0" w:evenVBand="0" w:oddHBand="0" w:evenHBand="0" w:firstRowFirstColumn="0" w:firstRowLastColumn="0" w:lastRowFirstColumn="0" w:lastRowLastColumn="0"/>
             <w:tcW w:w="737" w:type="dxa"/>
           </w:tcPr>
           <w:p>
+            <w:pPr>
+              <w:cnfStyle w:val="001000000000" w:firstRow="0" w:lastRow="0" w:firstColumn="1" w:lastColumn="0" w:oddVBand="0" w:evenVBand="0" w:oddHBand="0" w:evenHBand="0" w:firstRowFirstColumn="0" w:firstRowLastColumn="0" w:lastRowFirstColumn="0" w:lastRowLastColumn="0"/>
+            </w:pPr>
             <w:r>
               <w:rPr>
                 <w:rFonts w:ascii="Times New Roman" w:hAnsi="Times New Roman"/>
@@ -8565,12 +8909,9 @@
         </w:tc>
         <w:tc>
           <w:tcPr>
-            <w:tcW w:w="4025" w:type="dxa"/>
-          </w:tcPr>
-          <w:p>
-            <w:pPr>
-              <w:cnfStyle w:val="000000000000" w:firstRow="0" w:lastRow="0" w:firstColumn="0" w:lastColumn="0" w:oddVBand="0" w:evenVBand="0" w:oddHBand="0" w:evenHBand="0" w:firstRowFirstColumn="0" w:firstRowLastColumn="0" w:lastRowFirstColumn="0" w:lastRowLastColumn="0"/>
-            </w:pPr>
+            <w:tcW w:w="2745" w:type="dxa"/>
+          </w:tcPr>
+          <w:p>
             <w:r>
               <w:rPr>
                 <w:rFonts w:ascii="Times New Roman" w:hAnsi="Times New Roman"/>
@@ -8585,9 +8926,6 @@
             <w:tcW w:w="907" w:type="dxa"/>
           </w:tcPr>
           <w:p>
-            <w:pPr>
-              <w:cnfStyle w:val="000000000000" w:firstRow="0" w:lastRow="0" w:firstColumn="0" w:lastColumn="0" w:oddVBand="0" w:evenVBand="0" w:oddHBand="0" w:evenHBand="0" w:firstRowFirstColumn="0" w:firstRowLastColumn="0" w:lastRowFirstColumn="0" w:lastRowLastColumn="0"/>
-            </w:pPr>
             <w:r>
               <w:rPr>
                 <w:rFonts w:ascii="Times New Roman" w:hAnsi="Times New Roman"/>
@@ -8602,9 +8940,6 @@
             <w:tcW w:w="1587" w:type="dxa"/>
           </w:tcPr>
           <w:p>
-            <w:pPr>
-              <w:cnfStyle w:val="000000000000" w:firstRow="0" w:lastRow="0" w:firstColumn="0" w:lastColumn="0" w:oddVBand="0" w:evenVBand="0" w:oddHBand="0" w:evenHBand="0" w:firstRowFirstColumn="0" w:firstRowLastColumn="0" w:lastRowFirstColumn="0" w:lastRowLastColumn="0"/>
-            </w:pPr>
             <w:r>
               <w:rPr>
                 <w:rFonts w:ascii="Times New Roman" w:hAnsi="Times New Roman"/>
@@ -8619,9 +8954,6 @@
             <w:tcW w:w="1077" w:type="dxa"/>
           </w:tcPr>
           <w:p>
-            <w:pPr>
-              <w:cnfStyle w:val="000000000000" w:firstRow="0" w:lastRow="0" w:firstColumn="0" w:lastColumn="0" w:oddVBand="0" w:evenVBand="0" w:oddHBand="0" w:evenHBand="0" w:firstRowFirstColumn="0" w:firstRowLastColumn="0" w:lastRowFirstColumn="0" w:lastRowLastColumn="0"/>
-            </w:pPr>
             <w:r>
               <w:rPr>
                 <w:rFonts w:ascii="Times New Roman" w:hAnsi="Times New Roman"/>
@@ -8636,15 +8968,32 @@
             <w:tcW w:w="907" w:type="dxa"/>
           </w:tcPr>
           <w:p>
-            <w:pPr>
-              <w:cnfStyle w:val="000000000000" w:firstRow="0" w:lastRow="0" w:firstColumn="0" w:lastColumn="0" w:oddVBand="0" w:evenVBand="0" w:oddHBand="0" w:evenHBand="0" w:firstRowFirstColumn="0" w:firstRowLastColumn="0" w:lastRowFirstColumn="0" w:lastRowLastColumn="0"/>
-            </w:pPr>
             <w:r>
               <w:rPr>
                 <w:rFonts w:ascii="Times New Roman" w:hAnsi="Times New Roman"/>
                 <w:sz w:val="20"/>
               </w:rPr>
               <w:t>Médio</w:t>
+            </w:r>
+          </w:p>
+        </w:tc>
+        <w:tc>
+          <w:tcPr>
+            <w:tcW w:w="1280" w:type="dxa"/>
+          </w:tcPr>
+          <w:p>
+            <w:pPr>
+              <w:rPr>
+                <w:rFonts w:ascii="Times New Roman" w:hAnsi="Times New Roman"/>
+                <w:sz w:val="20"/>
+              </w:rPr>
+            </w:pPr>
+            <w:r>
+              <w:rPr>
+                <w:rFonts w:ascii="Times New Roman" w:hAnsi="Times New Roman"/>
+                <w:sz w:val="20"/>
+              </w:rPr>
+              <w:t>Em aberto</w:t>
             </w:r>
           </w:p>
         </w:tc>
@@ -8670,7 +9019,7 @@
         </w:tc>
         <w:tc>
           <w:tcPr>
-            <w:tcW w:w="4025" w:type="dxa"/>
+            <w:tcW w:w="2745" w:type="dxa"/>
           </w:tcPr>
           <w:p>
             <w:pPr>
@@ -8753,14 +9102,37 @@
             </w:r>
           </w:p>
         </w:tc>
+        <w:tc>
+          <w:tcPr>
+            <w:tcW w:w="1280" w:type="dxa"/>
+          </w:tcPr>
+          <w:p>
+            <w:pPr>
+              <w:cnfStyle w:val="000000100000" w:firstRow="0" w:lastRow="0" w:firstColumn="0" w:lastColumn="0" w:oddVBand="0" w:evenVBand="0" w:oddHBand="1" w:evenHBand="0" w:firstRowFirstColumn="0" w:firstRowLastColumn="0" w:lastRowFirstColumn="0" w:lastRowLastColumn="0"/>
+              <w:rPr>
+                <w:rFonts w:ascii="Times New Roman" w:hAnsi="Times New Roman"/>
+                <w:sz w:val="20"/>
+              </w:rPr>
+            </w:pPr>
+            <w:r>
+              <w:rPr>
+                <w:rFonts w:ascii="Times New Roman" w:hAnsi="Times New Roman"/>
+                <w:sz w:val="20"/>
+              </w:rPr>
+              <w:t>Corrigido</w:t>
+            </w:r>
+          </w:p>
+        </w:tc>
       </w:tr>
       <w:tr>
         <w:tc>
           <w:tcPr>
-            <w:cnfStyle w:val="001000000000" w:firstRow="0" w:lastRow="0" w:firstColumn="1" w:lastColumn="0" w:oddVBand="0" w:evenVBand="0" w:oddHBand="0" w:evenHBand="0" w:firstRowFirstColumn="0" w:firstRowLastColumn="0" w:lastRowFirstColumn="0" w:lastRowLastColumn="0"/>
             <w:tcW w:w="737" w:type="dxa"/>
           </w:tcPr>
           <w:p>
+            <w:pPr>
+              <w:cnfStyle w:val="001000000000" w:firstRow="0" w:lastRow="0" w:firstColumn="1" w:lastColumn="0" w:oddVBand="0" w:evenVBand="0" w:oddHBand="0" w:evenHBand="0" w:firstRowFirstColumn="0" w:firstRowLastColumn="0" w:lastRowFirstColumn="0" w:lastRowLastColumn="0"/>
+            </w:pPr>
             <w:r>
               <w:rPr>
                 <w:rFonts w:ascii="Times New Roman" w:hAnsi="Times New Roman"/>
@@ -8772,12 +9144,9 @@
         </w:tc>
         <w:tc>
           <w:tcPr>
-            <w:tcW w:w="4025" w:type="dxa"/>
-          </w:tcPr>
-          <w:p>
-            <w:pPr>
-              <w:cnfStyle w:val="000000000000" w:firstRow="0" w:lastRow="0" w:firstColumn="0" w:lastColumn="0" w:oddVBand="0" w:evenVBand="0" w:oddHBand="0" w:evenHBand="0" w:firstRowFirstColumn="0" w:firstRowLastColumn="0" w:lastRowFirstColumn="0" w:lastRowLastColumn="0"/>
-            </w:pPr>
+            <w:tcW w:w="2745" w:type="dxa"/>
+          </w:tcPr>
+          <w:p>
             <w:r>
               <w:rPr>
                 <w:rFonts w:ascii="Times New Roman" w:hAnsi="Times New Roman"/>
@@ -8792,9 +9161,6 @@
             <w:tcW w:w="907" w:type="dxa"/>
           </w:tcPr>
           <w:p>
-            <w:pPr>
-              <w:cnfStyle w:val="000000000000" w:firstRow="0" w:lastRow="0" w:firstColumn="0" w:lastColumn="0" w:oddVBand="0" w:evenVBand="0" w:oddHBand="0" w:evenHBand="0" w:firstRowFirstColumn="0" w:firstRowLastColumn="0" w:lastRowFirstColumn="0" w:lastRowLastColumn="0"/>
-            </w:pPr>
             <w:r>
               <w:rPr>
                 <w:rFonts w:ascii="Times New Roman" w:hAnsi="Times New Roman"/>
@@ -8809,9 +9175,6 @@
             <w:tcW w:w="1587" w:type="dxa"/>
           </w:tcPr>
           <w:p>
-            <w:pPr>
-              <w:cnfStyle w:val="000000000000" w:firstRow="0" w:lastRow="0" w:firstColumn="0" w:lastColumn="0" w:oddVBand="0" w:evenVBand="0" w:oddHBand="0" w:evenHBand="0" w:firstRowFirstColumn="0" w:firstRowLastColumn="0" w:lastRowFirstColumn="0" w:lastRowLastColumn="0"/>
-            </w:pPr>
             <w:r>
               <w:rPr>
                 <w:rFonts w:ascii="Times New Roman" w:hAnsi="Times New Roman"/>
@@ -8826,9 +9189,6 @@
             <w:tcW w:w="1077" w:type="dxa"/>
           </w:tcPr>
           <w:p>
-            <w:pPr>
-              <w:cnfStyle w:val="000000000000" w:firstRow="0" w:lastRow="0" w:firstColumn="0" w:lastColumn="0" w:oddVBand="0" w:evenVBand="0" w:oddHBand="0" w:evenHBand="0" w:firstRowFirstColumn="0" w:firstRowLastColumn="0" w:lastRowFirstColumn="0" w:lastRowLastColumn="0"/>
-            </w:pPr>
             <w:r>
               <w:rPr>
                 <w:rFonts w:ascii="Times New Roman" w:hAnsi="Times New Roman"/>
@@ -8843,15 +9203,32 @@
             <w:tcW w:w="907" w:type="dxa"/>
           </w:tcPr>
           <w:p>
-            <w:pPr>
-              <w:cnfStyle w:val="000000000000" w:firstRow="0" w:lastRow="0" w:firstColumn="0" w:lastColumn="0" w:oddVBand="0" w:evenVBand="0" w:oddHBand="0" w:evenHBand="0" w:firstRowFirstColumn="0" w:firstRowLastColumn="0" w:lastRowFirstColumn="0" w:lastRowLastColumn="0"/>
-            </w:pPr>
             <w:r>
               <w:rPr>
                 <w:rFonts w:ascii="Times New Roman" w:hAnsi="Times New Roman"/>
                 <w:sz w:val="20"/>
               </w:rPr>
               <w:t>Médio</w:t>
+            </w:r>
+          </w:p>
+        </w:tc>
+        <w:tc>
+          <w:tcPr>
+            <w:tcW w:w="1280" w:type="dxa"/>
+          </w:tcPr>
+          <w:p>
+            <w:pPr>
+              <w:rPr>
+                <w:rFonts w:ascii="Times New Roman" w:hAnsi="Times New Roman"/>
+                <w:sz w:val="20"/>
+              </w:rPr>
+            </w:pPr>
+            <w:r>
+              <w:rPr>
+                <w:rFonts w:ascii="Times New Roman" w:hAnsi="Times New Roman"/>
+                <w:sz w:val="20"/>
+              </w:rPr>
+              <w:t>Corrigido</w:t>
             </w:r>
           </w:p>
         </w:tc>
@@ -8877,7 +9254,7 @@
         </w:tc>
         <w:tc>
           <w:tcPr>
-            <w:tcW w:w="4025" w:type="dxa"/>
+            <w:tcW w:w="2745" w:type="dxa"/>
           </w:tcPr>
           <w:p>
             <w:pPr>
@@ -8960,14 +9337,37 @@
             </w:r>
           </w:p>
         </w:tc>
+        <w:tc>
+          <w:tcPr>
+            <w:tcW w:w="1280" w:type="dxa"/>
+          </w:tcPr>
+          <w:p>
+            <w:pPr>
+              <w:cnfStyle w:val="000000100000" w:firstRow="0" w:lastRow="0" w:firstColumn="0" w:lastColumn="0" w:oddVBand="0" w:evenVBand="0" w:oddHBand="1" w:evenHBand="0" w:firstRowFirstColumn="0" w:firstRowLastColumn="0" w:lastRowFirstColumn="0" w:lastRowLastColumn="0"/>
+              <w:rPr>
+                <w:rFonts w:ascii="Times New Roman" w:hAnsi="Times New Roman"/>
+                <w:sz w:val="20"/>
+              </w:rPr>
+            </w:pPr>
+            <w:r>
+              <w:rPr>
+                <w:rFonts w:ascii="Times New Roman" w:hAnsi="Times New Roman"/>
+                <w:sz w:val="20"/>
+              </w:rPr>
+              <w:t>Em aberto</w:t>
+            </w:r>
+          </w:p>
+        </w:tc>
       </w:tr>
       <w:tr>
         <w:tc>
           <w:tcPr>
-            <w:cnfStyle w:val="001000000000" w:firstRow="0" w:lastRow="0" w:firstColumn="1" w:lastColumn="0" w:oddVBand="0" w:evenVBand="0" w:oddHBand="0" w:evenHBand="0" w:firstRowFirstColumn="0" w:firstRowLastColumn="0" w:lastRowFirstColumn="0" w:lastRowLastColumn="0"/>
             <w:tcW w:w="737" w:type="dxa"/>
           </w:tcPr>
           <w:p>
+            <w:pPr>
+              <w:cnfStyle w:val="001000000000" w:firstRow="0" w:lastRow="0" w:firstColumn="1" w:lastColumn="0" w:oddVBand="0" w:evenVBand="0" w:oddHBand="0" w:evenHBand="0" w:firstRowFirstColumn="0" w:firstRowLastColumn="0" w:lastRowFirstColumn="0" w:lastRowLastColumn="0"/>
+            </w:pPr>
             <w:r>
               <w:rPr>
                 <w:rFonts w:ascii="Times New Roman" w:hAnsi="Times New Roman"/>
@@ -8979,12 +9379,9 @@
         </w:tc>
         <w:tc>
           <w:tcPr>
-            <w:tcW w:w="4025" w:type="dxa"/>
-          </w:tcPr>
-          <w:p>
-            <w:pPr>
-              <w:cnfStyle w:val="000000000000" w:firstRow="0" w:lastRow="0" w:firstColumn="0" w:lastColumn="0" w:oddVBand="0" w:evenVBand="0" w:oddHBand="0" w:evenHBand="0" w:firstRowFirstColumn="0" w:firstRowLastColumn="0" w:lastRowFirstColumn="0" w:lastRowLastColumn="0"/>
-            </w:pPr>
+            <w:tcW w:w="2745" w:type="dxa"/>
+          </w:tcPr>
+          <w:p>
             <w:r>
               <w:rPr>
                 <w:rFonts w:ascii="Times New Roman" w:hAnsi="Times New Roman"/>
@@ -8999,9 +9396,6 @@
             <w:tcW w:w="907" w:type="dxa"/>
           </w:tcPr>
           <w:p>
-            <w:pPr>
-              <w:cnfStyle w:val="000000000000" w:firstRow="0" w:lastRow="0" w:firstColumn="0" w:lastColumn="0" w:oddVBand="0" w:evenVBand="0" w:oddHBand="0" w:evenHBand="0" w:firstRowFirstColumn="0" w:firstRowLastColumn="0" w:lastRowFirstColumn="0" w:lastRowLastColumn="0"/>
-            </w:pPr>
             <w:r>
               <w:rPr>
                 <w:rFonts w:ascii="Times New Roman" w:hAnsi="Times New Roman"/>
@@ -9016,9 +9410,6 @@
             <w:tcW w:w="1587" w:type="dxa"/>
           </w:tcPr>
           <w:p>
-            <w:pPr>
-              <w:cnfStyle w:val="000000000000" w:firstRow="0" w:lastRow="0" w:firstColumn="0" w:lastColumn="0" w:oddVBand="0" w:evenVBand="0" w:oddHBand="0" w:evenHBand="0" w:firstRowFirstColumn="0" w:firstRowLastColumn="0" w:lastRowFirstColumn="0" w:lastRowLastColumn="0"/>
-            </w:pPr>
             <w:r>
               <w:rPr>
                 <w:rFonts w:ascii="Times New Roman" w:hAnsi="Times New Roman"/>
@@ -9033,9 +9424,6 @@
             <w:tcW w:w="1077" w:type="dxa"/>
           </w:tcPr>
           <w:p>
-            <w:pPr>
-              <w:cnfStyle w:val="000000000000" w:firstRow="0" w:lastRow="0" w:firstColumn="0" w:lastColumn="0" w:oddVBand="0" w:evenVBand="0" w:oddHBand="0" w:evenHBand="0" w:firstRowFirstColumn="0" w:firstRowLastColumn="0" w:lastRowFirstColumn="0" w:lastRowLastColumn="0"/>
-            </w:pPr>
             <w:r>
               <w:rPr>
                 <w:rFonts w:ascii="Times New Roman" w:hAnsi="Times New Roman"/>
@@ -9050,15 +9438,32 @@
             <w:tcW w:w="907" w:type="dxa"/>
           </w:tcPr>
           <w:p>
-            <w:pPr>
-              <w:cnfStyle w:val="000000000000" w:firstRow="0" w:lastRow="0" w:firstColumn="0" w:lastColumn="0" w:oddVBand="0" w:evenVBand="0" w:oddHBand="0" w:evenHBand="0" w:firstRowFirstColumn="0" w:firstRowLastColumn="0" w:lastRowFirstColumn="0" w:lastRowLastColumn="0"/>
-            </w:pPr>
             <w:r>
               <w:rPr>
                 <w:rFonts w:ascii="Times New Roman" w:hAnsi="Times New Roman"/>
                 <w:sz w:val="20"/>
               </w:rPr>
               <w:t>Médio</w:t>
+            </w:r>
+          </w:p>
+        </w:tc>
+        <w:tc>
+          <w:tcPr>
+            <w:tcW w:w="1280" w:type="dxa"/>
+          </w:tcPr>
+          <w:p>
+            <w:pPr>
+              <w:rPr>
+                <w:rFonts w:ascii="Times New Roman" w:hAnsi="Times New Roman"/>
+                <w:sz w:val="20"/>
+              </w:rPr>
+            </w:pPr>
+            <w:r>
+              <w:rPr>
+                <w:rFonts w:ascii="Times New Roman" w:hAnsi="Times New Roman"/>
+                <w:sz w:val="20"/>
+              </w:rPr>
+              <w:t>Em aberto</w:t>
             </w:r>
           </w:p>
         </w:tc>
@@ -9084,7 +9489,7 @@
         </w:tc>
         <w:tc>
           <w:tcPr>
-            <w:tcW w:w="4025" w:type="dxa"/>
+            <w:tcW w:w="2745" w:type="dxa"/>
           </w:tcPr>
           <w:p>
             <w:pPr>
@@ -9167,14 +9572,37 @@
             </w:r>
           </w:p>
         </w:tc>
+        <w:tc>
+          <w:tcPr>
+            <w:tcW w:w="1280" w:type="dxa"/>
+          </w:tcPr>
+          <w:p>
+            <w:pPr>
+              <w:cnfStyle w:val="000000100000" w:firstRow="0" w:lastRow="0" w:firstColumn="0" w:lastColumn="0" w:oddVBand="0" w:evenVBand="0" w:oddHBand="1" w:evenHBand="0" w:firstRowFirstColumn="0" w:firstRowLastColumn="0" w:lastRowFirstColumn="0" w:lastRowLastColumn="0"/>
+              <w:rPr>
+                <w:rFonts w:ascii="Times New Roman" w:hAnsi="Times New Roman"/>
+                <w:sz w:val="20"/>
+              </w:rPr>
+            </w:pPr>
+            <w:r>
+              <w:rPr>
+                <w:rFonts w:ascii="Times New Roman" w:hAnsi="Times New Roman"/>
+                <w:sz w:val="20"/>
+              </w:rPr>
+              <w:t>Em aberto</w:t>
+            </w:r>
+          </w:p>
+        </w:tc>
       </w:tr>
       <w:tr>
         <w:tc>
           <w:tcPr>
-            <w:cnfStyle w:val="001000000000" w:firstRow="0" w:lastRow="0" w:firstColumn="1" w:lastColumn="0" w:oddVBand="0" w:evenVBand="0" w:oddHBand="0" w:evenHBand="0" w:firstRowFirstColumn="0" w:firstRowLastColumn="0" w:lastRowFirstColumn="0" w:lastRowLastColumn="0"/>
             <w:tcW w:w="737" w:type="dxa"/>
           </w:tcPr>
           <w:p>
+            <w:pPr>
+              <w:cnfStyle w:val="001000000000" w:firstRow="0" w:lastRow="0" w:firstColumn="1" w:lastColumn="0" w:oddVBand="0" w:evenVBand="0" w:oddHBand="0" w:evenHBand="0" w:firstRowFirstColumn="0" w:firstRowLastColumn="0" w:lastRowFirstColumn="0" w:lastRowLastColumn="0"/>
+            </w:pPr>
             <w:r>
               <w:rPr>
                 <w:rFonts w:ascii="Times New Roman" w:hAnsi="Times New Roman"/>
@@ -9186,12 +9614,9 @@
         </w:tc>
         <w:tc>
           <w:tcPr>
-            <w:tcW w:w="4025" w:type="dxa"/>
-          </w:tcPr>
-          <w:p>
-            <w:pPr>
-              <w:cnfStyle w:val="000000000000" w:firstRow="0" w:lastRow="0" w:firstColumn="0" w:lastColumn="0" w:oddVBand="0" w:evenVBand="0" w:oddHBand="0" w:evenHBand="0" w:firstRowFirstColumn="0" w:firstRowLastColumn="0" w:lastRowFirstColumn="0" w:lastRowLastColumn="0"/>
-            </w:pPr>
+            <w:tcW w:w="2745" w:type="dxa"/>
+          </w:tcPr>
+          <w:p>
             <w:r>
               <w:rPr>
                 <w:rFonts w:ascii="Times New Roman" w:hAnsi="Times New Roman"/>
@@ -9206,9 +9631,6 @@
             <w:tcW w:w="907" w:type="dxa"/>
           </w:tcPr>
           <w:p>
-            <w:pPr>
-              <w:cnfStyle w:val="000000000000" w:firstRow="0" w:lastRow="0" w:firstColumn="0" w:lastColumn="0" w:oddVBand="0" w:evenVBand="0" w:oddHBand="0" w:evenHBand="0" w:firstRowFirstColumn="0" w:firstRowLastColumn="0" w:lastRowFirstColumn="0" w:lastRowLastColumn="0"/>
-            </w:pPr>
             <w:r>
               <w:rPr>
                 <w:rFonts w:ascii="Times New Roman" w:hAnsi="Times New Roman"/>
@@ -9223,9 +9645,6 @@
             <w:tcW w:w="1587" w:type="dxa"/>
           </w:tcPr>
           <w:p>
-            <w:pPr>
-              <w:cnfStyle w:val="000000000000" w:firstRow="0" w:lastRow="0" w:firstColumn="0" w:lastColumn="0" w:oddVBand="0" w:evenVBand="0" w:oddHBand="0" w:evenHBand="0" w:firstRowFirstColumn="0" w:firstRowLastColumn="0" w:lastRowFirstColumn="0" w:lastRowLastColumn="0"/>
-            </w:pPr>
             <w:r>
               <w:rPr>
                 <w:rFonts w:ascii="Times New Roman" w:hAnsi="Times New Roman"/>
@@ -9240,9 +9659,6 @@
             <w:tcW w:w="1077" w:type="dxa"/>
           </w:tcPr>
           <w:p>
-            <w:pPr>
-              <w:cnfStyle w:val="000000000000" w:firstRow="0" w:lastRow="0" w:firstColumn="0" w:lastColumn="0" w:oddVBand="0" w:evenVBand="0" w:oddHBand="0" w:evenHBand="0" w:firstRowFirstColumn="0" w:firstRowLastColumn="0" w:lastRowFirstColumn="0" w:lastRowLastColumn="0"/>
-            </w:pPr>
             <w:r>
               <w:rPr>
                 <w:rFonts w:ascii="Times New Roman" w:hAnsi="Times New Roman"/>
@@ -9257,15 +9673,32 @@
             <w:tcW w:w="907" w:type="dxa"/>
           </w:tcPr>
           <w:p>
-            <w:pPr>
-              <w:cnfStyle w:val="000000000000" w:firstRow="0" w:lastRow="0" w:firstColumn="0" w:lastColumn="0" w:oddVBand="0" w:evenVBand="0" w:oddHBand="0" w:evenHBand="0" w:firstRowFirstColumn="0" w:firstRowLastColumn="0" w:lastRowFirstColumn="0" w:lastRowLastColumn="0"/>
-            </w:pPr>
             <w:r>
               <w:rPr>
                 <w:rFonts w:ascii="Times New Roman" w:hAnsi="Times New Roman"/>
                 <w:sz w:val="20"/>
               </w:rPr>
               <w:t>Baixo</w:t>
+            </w:r>
+          </w:p>
+        </w:tc>
+        <w:tc>
+          <w:tcPr>
+            <w:tcW w:w="1280" w:type="dxa"/>
+          </w:tcPr>
+          <w:p>
+            <w:pPr>
+              <w:rPr>
+                <w:rFonts w:ascii="Times New Roman" w:hAnsi="Times New Roman"/>
+                <w:sz w:val="20"/>
+              </w:rPr>
+            </w:pPr>
+            <w:r>
+              <w:rPr>
+                <w:rFonts w:ascii="Times New Roman" w:hAnsi="Times New Roman"/>
+                <w:sz w:val="20"/>
+              </w:rPr>
+              <w:t>Corrigido</w:t>
             </w:r>
           </w:p>
         </w:tc>
@@ -9291,7 +9724,7 @@
         </w:tc>
         <w:tc>
           <w:tcPr>
-            <w:tcW w:w="4025" w:type="dxa"/>
+            <w:tcW w:w="2745" w:type="dxa"/>
           </w:tcPr>
           <w:p>
             <w:pPr>
@@ -9374,14 +9807,37 @@
             </w:r>
           </w:p>
         </w:tc>
+        <w:tc>
+          <w:tcPr>
+            <w:tcW w:w="1280" w:type="dxa"/>
+          </w:tcPr>
+          <w:p>
+            <w:pPr>
+              <w:cnfStyle w:val="000000100000" w:firstRow="0" w:lastRow="0" w:firstColumn="0" w:lastColumn="0" w:oddVBand="0" w:evenVBand="0" w:oddHBand="1" w:evenHBand="0" w:firstRowFirstColumn="0" w:firstRowLastColumn="0" w:lastRowFirstColumn="0" w:lastRowLastColumn="0"/>
+              <w:rPr>
+                <w:rFonts w:ascii="Times New Roman" w:hAnsi="Times New Roman"/>
+                <w:sz w:val="20"/>
+              </w:rPr>
+            </w:pPr>
+            <w:r>
+              <w:rPr>
+                <w:rFonts w:ascii="Times New Roman" w:hAnsi="Times New Roman"/>
+                <w:sz w:val="20"/>
+              </w:rPr>
+              <w:t>Corrigido</w:t>
+            </w:r>
+          </w:p>
+        </w:tc>
       </w:tr>
       <w:tr>
         <w:tc>
           <w:tcPr>
-            <w:cnfStyle w:val="001000000000" w:firstRow="0" w:lastRow="0" w:firstColumn="1" w:lastColumn="0" w:oddVBand="0" w:evenVBand="0" w:oddHBand="0" w:evenHBand="0" w:firstRowFirstColumn="0" w:firstRowLastColumn="0" w:lastRowFirstColumn="0" w:lastRowLastColumn="0"/>
             <w:tcW w:w="737" w:type="dxa"/>
           </w:tcPr>
           <w:p>
+            <w:pPr>
+              <w:cnfStyle w:val="001000000000" w:firstRow="0" w:lastRow="0" w:firstColumn="1" w:lastColumn="0" w:oddVBand="0" w:evenVBand="0" w:oddHBand="0" w:evenHBand="0" w:firstRowFirstColumn="0" w:firstRowLastColumn="0" w:lastRowFirstColumn="0" w:lastRowLastColumn="0"/>
+            </w:pPr>
             <w:r>
               <w:rPr>
                 <w:rFonts w:ascii="Times New Roman" w:hAnsi="Times New Roman"/>
@@ -9393,12 +9849,9 @@
         </w:tc>
         <w:tc>
           <w:tcPr>
-            <w:tcW w:w="4025" w:type="dxa"/>
-          </w:tcPr>
-          <w:p>
-            <w:pPr>
-              <w:cnfStyle w:val="000000000000" w:firstRow="0" w:lastRow="0" w:firstColumn="0" w:lastColumn="0" w:oddVBand="0" w:evenVBand="0" w:oddHBand="0" w:evenHBand="0" w:firstRowFirstColumn="0" w:firstRowLastColumn="0" w:lastRowFirstColumn="0" w:lastRowLastColumn="0"/>
-            </w:pPr>
+            <w:tcW w:w="2745" w:type="dxa"/>
+          </w:tcPr>
+          <w:p>
             <w:r>
               <w:rPr>
                 <w:rFonts w:ascii="Times New Roman" w:hAnsi="Times New Roman"/>
@@ -9413,9 +9866,6 @@
             <w:tcW w:w="907" w:type="dxa"/>
           </w:tcPr>
           <w:p>
-            <w:pPr>
-              <w:cnfStyle w:val="000000000000" w:firstRow="0" w:lastRow="0" w:firstColumn="0" w:lastColumn="0" w:oddVBand="0" w:evenVBand="0" w:oddHBand="0" w:evenHBand="0" w:firstRowFirstColumn="0" w:firstRowLastColumn="0" w:lastRowFirstColumn="0" w:lastRowLastColumn="0"/>
-            </w:pPr>
             <w:r>
               <w:rPr>
                 <w:rFonts w:ascii="Times New Roman" w:hAnsi="Times New Roman"/>
@@ -9430,9 +9880,6 @@
             <w:tcW w:w="1587" w:type="dxa"/>
           </w:tcPr>
           <w:p>
-            <w:pPr>
-              <w:cnfStyle w:val="000000000000" w:firstRow="0" w:lastRow="0" w:firstColumn="0" w:lastColumn="0" w:oddVBand="0" w:evenVBand="0" w:oddHBand="0" w:evenHBand="0" w:firstRowFirstColumn="0" w:firstRowLastColumn="0" w:lastRowFirstColumn="0" w:lastRowLastColumn="0"/>
-            </w:pPr>
             <w:r>
               <w:rPr>
                 <w:rFonts w:ascii="Times New Roman" w:hAnsi="Times New Roman"/>
@@ -9447,9 +9894,6 @@
             <w:tcW w:w="1077" w:type="dxa"/>
           </w:tcPr>
           <w:p>
-            <w:pPr>
-              <w:cnfStyle w:val="000000000000" w:firstRow="0" w:lastRow="0" w:firstColumn="0" w:lastColumn="0" w:oddVBand="0" w:evenVBand="0" w:oddHBand="0" w:evenHBand="0" w:firstRowFirstColumn="0" w:firstRowLastColumn="0" w:lastRowFirstColumn="0" w:lastRowLastColumn="0"/>
-            </w:pPr>
             <w:r>
               <w:rPr>
                 <w:rFonts w:ascii="Times New Roman" w:hAnsi="Times New Roman"/>
@@ -9464,15 +9908,32 @@
             <w:tcW w:w="907" w:type="dxa"/>
           </w:tcPr>
           <w:p>
-            <w:pPr>
-              <w:cnfStyle w:val="000000000000" w:firstRow="0" w:lastRow="0" w:firstColumn="0" w:lastColumn="0" w:oddVBand="0" w:evenVBand="0" w:oddHBand="0" w:evenHBand="0" w:firstRowFirstColumn="0" w:firstRowLastColumn="0" w:lastRowFirstColumn="0" w:lastRowLastColumn="0"/>
-            </w:pPr>
             <w:r>
               <w:rPr>
                 <w:rFonts w:ascii="Times New Roman" w:hAnsi="Times New Roman"/>
                 <w:sz w:val="20"/>
               </w:rPr>
               <w:t>Baixo</w:t>
+            </w:r>
+          </w:p>
+        </w:tc>
+        <w:tc>
+          <w:tcPr>
+            <w:tcW w:w="1280" w:type="dxa"/>
+          </w:tcPr>
+          <w:p>
+            <w:pPr>
+              <w:rPr>
+                <w:rFonts w:ascii="Times New Roman" w:hAnsi="Times New Roman"/>
+                <w:sz w:val="20"/>
+              </w:rPr>
+            </w:pPr>
+            <w:r>
+              <w:rPr>
+                <w:rFonts w:ascii="Times New Roman" w:hAnsi="Times New Roman"/>
+                <w:sz w:val="20"/>
+              </w:rPr>
+              <w:t>Corrigido</w:t>
             </w:r>
           </w:p>
         </w:tc>
@@ -9498,7 +9959,7 @@
         </w:tc>
         <w:tc>
           <w:tcPr>
-            <w:tcW w:w="4025" w:type="dxa"/>
+            <w:tcW w:w="2745" w:type="dxa"/>
           </w:tcPr>
           <w:p>
             <w:pPr>
@@ -9578,6 +10039,27 @@
                 <w:sz w:val="20"/>
               </w:rPr>
               <w:t>Baixo</w:t>
+            </w:r>
+          </w:p>
+        </w:tc>
+        <w:tc>
+          <w:tcPr>
+            <w:tcW w:w="1280" w:type="dxa"/>
+          </w:tcPr>
+          <w:p>
+            <w:pPr>
+              <w:cnfStyle w:val="000000100000" w:firstRow="0" w:lastRow="0" w:firstColumn="0" w:lastColumn="0" w:oddVBand="0" w:evenVBand="0" w:oddHBand="1" w:evenHBand="0" w:firstRowFirstColumn="0" w:firstRowLastColumn="0" w:lastRowFirstColumn="0" w:lastRowLastColumn="0"/>
+              <w:rPr>
+                <w:rFonts w:ascii="Times New Roman" w:hAnsi="Times New Roman"/>
+                <w:sz w:val="20"/>
+              </w:rPr>
+            </w:pPr>
+            <w:r>
+              <w:rPr>
+                <w:rFonts w:ascii="Times New Roman" w:hAnsi="Times New Roman"/>
+                <w:sz w:val="20"/>
+              </w:rPr>
+              <w:t>Corrigido</w:t>
             </w:r>
           </w:p>
         </w:tc>
@@ -9866,7 +10348,31 @@
         <w:rPr>
           <w:rFonts w:ascii="Times New Roman" w:eastAsia="Times New Roman" w:hAnsi="Times New Roman" w:cs="Times New Roman"/>
         </w:rPr>
-        <w:t>Cadastro e login dos usuários com autenticação em duas etapas (TOTP) na área da conta. O painel administrativo (/admin/) ainda pede apenas senha, sem o segundo fator (risco R01 da avaliação de segurança); a correção planejada é trocar o painel padrão do Django pelo OTPAdminSite, do django-otp, exigindo dispositivo 2FA confirmado das contas da equipe;</w:t>
+        <w:t>Cadastro e login dos usuários com autenticação em duas etapas (TOTP), obrigatória para as contas da equipe.</w:t>
+      </w:r>
+      <w:r>
+        <w:rPr>
+          <w:rFonts w:ascii="Times New Roman" w:eastAsia="Times New Roman" w:hAnsi="Times New Roman" w:cs="Times New Roman"/>
+        </w:rPr>
+        <w:t xml:space="preserve"> </w:t>
+      </w:r>
+      <w:r>
+        <w:rPr>
+          <w:rFonts w:ascii="Times New Roman" w:eastAsia="Times New Roman" w:hAnsi="Times New Roman" w:cs="Times New Roman"/>
+        </w:rPr>
+        <w:t>O painel administrativo (/admin/) também exige o código TOTP, pelo OTPAdminSite do django-otp (risco R01 corrigido),</w:t>
+      </w:r>
+      <w:r>
+        <w:rPr>
+          <w:rFonts w:ascii="Times New Roman" w:eastAsia="Times New Roman" w:hAnsi="Times New Roman" w:cs="Times New Roman"/>
+        </w:rPr>
+        <w:t xml:space="preserve"> </w:t>
+      </w:r>
+      <w:r>
+        <w:rPr>
+          <w:rFonts w:ascii="Times New Roman" w:eastAsia="Times New Roman" w:hAnsi="Times New Roman" w:cs="Times New Roman"/>
+        </w:rPr>
+        <w:t>e quem perde o celular entra com um dos códigos de reserva;</w:t>
       </w:r>
       <w:r>
         <w:br/>
@@ -12002,7 +12508,7 @@
           <w:noProof/>
         </w:rPr>
         <w:drawing>
-          <wp:inline distT="0" distB="0" distL="0" distR="0" wp14:anchorId="5F13D73D" wp14:editId="7AC2C47E">
+          <wp:inline distT="0" distB="0" distL="0" distR="0" wp14:anchorId="5F13D73D" wp14:editId="79896915">
             <wp:extent cx="5762625" cy="2737422"/>
             <wp:effectExtent l="0" t="0" r="0" b="6350"/>
             <wp:docPr id="859284772" name="Imagem 3"/>
@@ -12215,7 +12721,19 @@
         <w:rPr>
           <w:rFonts w:ascii="Times New Roman" w:eastAsia="Times New Roman" w:hAnsi="Times New Roman" w:cs="Times New Roman"/>
         </w:rPr>
-        <w:t>Na versão entregue, a suíte de testes automatizados soma 92 testes, todos aprovados, cobrindo os cinco blocos de requisitos do check-list.</w:t>
+        <w:t xml:space="preserve">Na versão entregue, </w:t>
+      </w:r>
+      <w:r>
+        <w:rPr>
+          <w:rFonts w:ascii="Times New Roman" w:eastAsia="Times New Roman" w:hAnsi="Times New Roman" w:cs="Times New Roman"/>
+        </w:rPr>
+        <w:t>a suíte de testes automatizados soma 146 testes</w:t>
+      </w:r>
+      <w:r>
+        <w:rPr>
+          <w:rFonts w:ascii="Times New Roman" w:eastAsia="Times New Roman" w:hAnsi="Times New Roman" w:cs="Times New Roman"/>
+        </w:rPr>
+        <w:t>, todos aprovados, cobrindo os cinco blocos de requisitos do check-list.</w:t>
       </w:r>
     </w:p>
     <w:p>
@@ -12318,7 +12836,13 @@
         <w:rPr>
           <w:rFonts w:ascii="Times New Roman" w:eastAsia="Times New Roman" w:hAnsi="Times New Roman"/>
         </w:rPr>
-        <w:t>itens em aberto para a etapa seguinte do projeto, assim como o tratamento dos riscos de nível Alto da matriz da seção 3.5 (R01 a R04).</w:t>
+        <w:t xml:space="preserve">itens em aberto para a etapa seguinte do projeto, </w:t>
+      </w:r>
+      <w:r>
+        <w:rPr>
+          <w:rFonts w:ascii="Times New Roman" w:eastAsia="Times New Roman" w:hAnsi="Times New Roman"/>
+        </w:rPr>
+        <w:t>assim como o tratamento dos riscos que seguem em aberto na matriz da seção 3.5, entre eles os de nível Alto R02 e R04 e a conclusão do R03.</w:t>
       </w:r>
     </w:p>
     <w:p>

</xml_diff>

<commit_message>
adiciona rota de saúde e backup cifrado do banco, aceita o risco do MaterialSalvo e atualiza a documentação
</commit_message>
<xml_diff>
--- a/docs/Health-In-Sight-Documentacao-Tecnico-Cientifica.docx
+++ b/docs/Health-In-Sight-Documentacao-Tecnico-Cientifica.docx
@@ -2340,7 +2340,7 @@
                 <w:noProof/>
                 <w:webHidden/>
               </w:rPr>
-              <w:t>16</w:t>
+              <w:t>17</w:t>
             </w:r>
             <w:r>
               <w:rPr>
@@ -2705,7 +2705,7 @@
                 <w:noProof/>
                 <w:webHidden/>
               </w:rPr>
-              <w:t>17</w:t>
+              <w:t>18</w:t>
             </w:r>
             <w:r>
               <w:rPr>
@@ -2851,7 +2851,7 @@
                 <w:noProof/>
                 <w:webHidden/>
               </w:rPr>
-              <w:t>18</w:t>
+              <w:t>19</w:t>
             </w:r>
             <w:r>
               <w:rPr>
@@ -2997,7 +2997,7 @@
                 <w:noProof/>
                 <w:webHidden/>
               </w:rPr>
-              <w:t>19</w:t>
+              <w:t>20</w:t>
             </w:r>
             <w:r>
               <w:rPr>
@@ -3143,7 +3143,7 @@
                 <w:noProof/>
                 <w:webHidden/>
               </w:rPr>
-              <w:t>20</w:t>
+              <w:t>21</w:t>
             </w:r>
             <w:r>
               <w:rPr>
@@ -3362,7 +3362,7 @@
                 <w:noProof/>
                 <w:webHidden/>
               </w:rPr>
-              <w:t>22</w:t>
+              <w:t>23</w:t>
             </w:r>
             <w:r>
               <w:rPr>
@@ -3435,7 +3435,7 @@
                 <w:noProof/>
                 <w:webHidden/>
               </w:rPr>
-              <w:t>22</w:t>
+              <w:t>23</w:t>
             </w:r>
             <w:r>
               <w:rPr>
@@ -3581,7 +3581,7 @@
                 <w:noProof/>
                 <w:webHidden/>
               </w:rPr>
-              <w:t>23</w:t>
+              <w:t>24</w:t>
             </w:r>
             <w:r>
               <w:rPr>
@@ -3654,7 +3654,7 @@
                 <w:noProof/>
                 <w:webHidden/>
               </w:rPr>
-              <w:t>23</w:t>
+              <w:t>24</w:t>
             </w:r>
             <w:r>
               <w:rPr>
@@ -8148,7 +8148,13 @@
         <w:rPr>
           <w:rFonts w:ascii="Times New Roman" w:eastAsia="Times New Roman" w:hAnsi="Times New Roman" w:cs="Times New Roman"/>
         </w:rPr>
-        <w:t>Os pilares são confidencialidade (C), integridade (I) e disponibilidade (D). A última coluna mostra a situação de cada risco depois das correções de outubro de 2026.</w:t>
+        <w:t xml:space="preserve">Os pilares são confidencialidade (C), integridade (I) e disponibilidade (D). </w:t>
+      </w:r>
+      <w:r>
+        <w:rPr>
+          <w:rFonts w:ascii="Times New Roman" w:eastAsia="Times New Roman" w:hAnsi="Times New Roman" w:cs="Times New Roman"/>
+        </w:rPr>
+        <w:t>A última coluna mostra a situação de cada risco depois das correções de outubro de 2026; “Parcial” indica que a correção no código está pronta, mas ainda depende de configuração nos painéis do Render, do Aiven ou do GitHub.</w:t>
       </w:r>
     </w:p>
     <w:tbl>
@@ -8523,7 +8529,7 @@
                 <w:rFonts w:ascii="Times New Roman" w:hAnsi="Times New Roman"/>
                 <w:sz w:val="20"/>
               </w:rPr>
-              <w:t>Em aberto</w:t>
+              <w:t>Parcial</w:t>
             </w:r>
           </w:p>
         </w:tc>
@@ -8758,7 +8764,7 @@
                 <w:rFonts w:ascii="Times New Roman" w:hAnsi="Times New Roman"/>
                 <w:sz w:val="20"/>
               </w:rPr>
-              <w:t>Em aberto</w:t>
+              <w:t>Parcial</w:t>
             </w:r>
           </w:p>
         </w:tc>
@@ -8892,12 +8898,10 @@
       <w:tr>
         <w:tc>
           <w:tcPr>
+            <w:cnfStyle w:val="001000000000" w:firstRow="0" w:lastRow="0" w:firstColumn="1" w:lastColumn="0" w:oddVBand="0" w:evenVBand="0" w:oddHBand="0" w:evenHBand="0" w:firstRowFirstColumn="0" w:firstRowLastColumn="0" w:lastRowFirstColumn="0" w:lastRowLastColumn="0"/>
             <w:tcW w:w="737" w:type="dxa"/>
           </w:tcPr>
           <w:p>
-            <w:pPr>
-              <w:cnfStyle w:val="001000000000" w:firstRow="0" w:lastRow="0" w:firstColumn="1" w:lastColumn="0" w:oddVBand="0" w:evenVBand="0" w:oddHBand="0" w:evenHBand="0" w:firstRowFirstColumn="0" w:firstRowLastColumn="0" w:lastRowFirstColumn="0" w:lastRowLastColumn="0"/>
-            </w:pPr>
             <w:r>
               <w:rPr>
                 <w:rFonts w:ascii="Times New Roman" w:hAnsi="Times New Roman"/>
@@ -8912,6 +8916,9 @@
             <w:tcW w:w="2745" w:type="dxa"/>
           </w:tcPr>
           <w:p>
+            <w:pPr>
+              <w:cnfStyle w:val="000000000000" w:firstRow="0" w:lastRow="0" w:firstColumn="0" w:lastColumn="0" w:oddVBand="0" w:evenVBand="0" w:oddHBand="0" w:evenHBand="0" w:firstRowFirstColumn="0" w:firstRowLastColumn="0" w:lastRowFirstColumn="0" w:lastRowLastColumn="0"/>
+            </w:pPr>
             <w:r>
               <w:rPr>
                 <w:rFonts w:ascii="Times New Roman" w:hAnsi="Times New Roman"/>
@@ -8926,6 +8933,9 @@
             <w:tcW w:w="907" w:type="dxa"/>
           </w:tcPr>
           <w:p>
+            <w:pPr>
+              <w:cnfStyle w:val="000000000000" w:firstRow="0" w:lastRow="0" w:firstColumn="0" w:lastColumn="0" w:oddVBand="0" w:evenVBand="0" w:oddHBand="0" w:evenHBand="0" w:firstRowFirstColumn="0" w:firstRowLastColumn="0" w:lastRowFirstColumn="0" w:lastRowLastColumn="0"/>
+            </w:pPr>
             <w:r>
               <w:rPr>
                 <w:rFonts w:ascii="Times New Roman" w:hAnsi="Times New Roman"/>
@@ -8940,6 +8950,9 @@
             <w:tcW w:w="1587" w:type="dxa"/>
           </w:tcPr>
           <w:p>
+            <w:pPr>
+              <w:cnfStyle w:val="000000000000" w:firstRow="0" w:lastRow="0" w:firstColumn="0" w:lastColumn="0" w:oddVBand="0" w:evenVBand="0" w:oddHBand="0" w:evenHBand="0" w:firstRowFirstColumn="0" w:firstRowLastColumn="0" w:lastRowFirstColumn="0" w:lastRowLastColumn="0"/>
+            </w:pPr>
             <w:r>
               <w:rPr>
                 <w:rFonts w:ascii="Times New Roman" w:hAnsi="Times New Roman"/>
@@ -8954,6 +8967,9 @@
             <w:tcW w:w="1077" w:type="dxa"/>
           </w:tcPr>
           <w:p>
+            <w:pPr>
+              <w:cnfStyle w:val="000000000000" w:firstRow="0" w:lastRow="0" w:firstColumn="0" w:lastColumn="0" w:oddVBand="0" w:evenVBand="0" w:oddHBand="0" w:evenHBand="0" w:firstRowFirstColumn="0" w:firstRowLastColumn="0" w:lastRowFirstColumn="0" w:lastRowLastColumn="0"/>
+            </w:pPr>
             <w:r>
               <w:rPr>
                 <w:rFonts w:ascii="Times New Roman" w:hAnsi="Times New Roman"/>
@@ -8968,6 +8984,9 @@
             <w:tcW w:w="907" w:type="dxa"/>
           </w:tcPr>
           <w:p>
+            <w:pPr>
+              <w:cnfStyle w:val="000000000000" w:firstRow="0" w:lastRow="0" w:firstColumn="0" w:lastColumn="0" w:oddVBand="0" w:evenVBand="0" w:oddHBand="0" w:evenHBand="0" w:firstRowFirstColumn="0" w:firstRowLastColumn="0" w:lastRowFirstColumn="0" w:lastRowLastColumn="0"/>
+            </w:pPr>
             <w:r>
               <w:rPr>
                 <w:rFonts w:ascii="Times New Roman" w:hAnsi="Times New Roman"/>
@@ -8983,6 +9002,7 @@
           </w:tcPr>
           <w:p>
             <w:pPr>
+              <w:cnfStyle w:val="000000000000" w:firstRow="0" w:lastRow="0" w:firstColumn="0" w:lastColumn="0" w:oddVBand="0" w:evenVBand="0" w:oddHBand="0" w:evenHBand="0" w:firstRowFirstColumn="0" w:firstRowLastColumn="0" w:lastRowFirstColumn="0" w:lastRowLastColumn="0"/>
               <w:rPr>
                 <w:rFonts w:ascii="Times New Roman" w:hAnsi="Times New Roman"/>
                 <w:sz w:val="20"/>
@@ -9127,12 +9147,10 @@
       <w:tr>
         <w:tc>
           <w:tcPr>
+            <w:cnfStyle w:val="001000000000" w:firstRow="0" w:lastRow="0" w:firstColumn="1" w:lastColumn="0" w:oddVBand="0" w:evenVBand="0" w:oddHBand="0" w:evenHBand="0" w:firstRowFirstColumn="0" w:firstRowLastColumn="0" w:lastRowFirstColumn="0" w:lastRowLastColumn="0"/>
             <w:tcW w:w="737" w:type="dxa"/>
           </w:tcPr>
           <w:p>
-            <w:pPr>
-              <w:cnfStyle w:val="001000000000" w:firstRow="0" w:lastRow="0" w:firstColumn="1" w:lastColumn="0" w:oddVBand="0" w:evenVBand="0" w:oddHBand="0" w:evenHBand="0" w:firstRowFirstColumn="0" w:firstRowLastColumn="0" w:lastRowFirstColumn="0" w:lastRowLastColumn="0"/>
-            </w:pPr>
             <w:r>
               <w:rPr>
                 <w:rFonts w:ascii="Times New Roman" w:hAnsi="Times New Roman"/>
@@ -9147,6 +9165,9 @@
             <w:tcW w:w="2745" w:type="dxa"/>
           </w:tcPr>
           <w:p>
+            <w:pPr>
+              <w:cnfStyle w:val="000000000000" w:firstRow="0" w:lastRow="0" w:firstColumn="0" w:lastColumn="0" w:oddVBand="0" w:evenVBand="0" w:oddHBand="0" w:evenHBand="0" w:firstRowFirstColumn="0" w:firstRowLastColumn="0" w:lastRowFirstColumn="0" w:lastRowLastColumn="0"/>
+            </w:pPr>
             <w:r>
               <w:rPr>
                 <w:rFonts w:ascii="Times New Roman" w:hAnsi="Times New Roman"/>
@@ -9161,6 +9182,9 @@
             <w:tcW w:w="907" w:type="dxa"/>
           </w:tcPr>
           <w:p>
+            <w:pPr>
+              <w:cnfStyle w:val="000000000000" w:firstRow="0" w:lastRow="0" w:firstColumn="0" w:lastColumn="0" w:oddVBand="0" w:evenVBand="0" w:oddHBand="0" w:evenHBand="0" w:firstRowFirstColumn="0" w:firstRowLastColumn="0" w:lastRowFirstColumn="0" w:lastRowLastColumn="0"/>
+            </w:pPr>
             <w:r>
               <w:rPr>
                 <w:rFonts w:ascii="Times New Roman" w:hAnsi="Times New Roman"/>
@@ -9175,6 +9199,9 @@
             <w:tcW w:w="1587" w:type="dxa"/>
           </w:tcPr>
           <w:p>
+            <w:pPr>
+              <w:cnfStyle w:val="000000000000" w:firstRow="0" w:lastRow="0" w:firstColumn="0" w:lastColumn="0" w:oddVBand="0" w:evenVBand="0" w:oddHBand="0" w:evenHBand="0" w:firstRowFirstColumn="0" w:firstRowLastColumn="0" w:lastRowFirstColumn="0" w:lastRowLastColumn="0"/>
+            </w:pPr>
             <w:r>
               <w:rPr>
                 <w:rFonts w:ascii="Times New Roman" w:hAnsi="Times New Roman"/>
@@ -9189,6 +9216,9 @@
             <w:tcW w:w="1077" w:type="dxa"/>
           </w:tcPr>
           <w:p>
+            <w:pPr>
+              <w:cnfStyle w:val="000000000000" w:firstRow="0" w:lastRow="0" w:firstColumn="0" w:lastColumn="0" w:oddVBand="0" w:evenVBand="0" w:oddHBand="0" w:evenHBand="0" w:firstRowFirstColumn="0" w:firstRowLastColumn="0" w:lastRowFirstColumn="0" w:lastRowLastColumn="0"/>
+            </w:pPr>
             <w:r>
               <w:rPr>
                 <w:rFonts w:ascii="Times New Roman" w:hAnsi="Times New Roman"/>
@@ -9203,6 +9233,9 @@
             <w:tcW w:w="907" w:type="dxa"/>
           </w:tcPr>
           <w:p>
+            <w:pPr>
+              <w:cnfStyle w:val="000000000000" w:firstRow="0" w:lastRow="0" w:firstColumn="0" w:lastColumn="0" w:oddVBand="0" w:evenVBand="0" w:oddHBand="0" w:evenHBand="0" w:firstRowFirstColumn="0" w:firstRowLastColumn="0" w:lastRowFirstColumn="0" w:lastRowLastColumn="0"/>
+            </w:pPr>
             <w:r>
               <w:rPr>
                 <w:rFonts w:ascii="Times New Roman" w:hAnsi="Times New Roman"/>
@@ -9218,6 +9251,7 @@
           </w:tcPr>
           <w:p>
             <w:pPr>
+              <w:cnfStyle w:val="000000000000" w:firstRow="0" w:lastRow="0" w:firstColumn="0" w:lastColumn="0" w:oddVBand="0" w:evenVBand="0" w:oddHBand="0" w:evenHBand="0" w:firstRowFirstColumn="0" w:firstRowLastColumn="0" w:lastRowFirstColumn="0" w:lastRowLastColumn="0"/>
               <w:rPr>
                 <w:rFonts w:ascii="Times New Roman" w:hAnsi="Times New Roman"/>
                 <w:sz w:val="20"/>
@@ -9354,7 +9388,7 @@
                 <w:rFonts w:ascii="Times New Roman" w:hAnsi="Times New Roman"/>
                 <w:sz w:val="20"/>
               </w:rPr>
-              <w:t>Em aberto</w:t>
+              <w:t>Corrigido</w:t>
             </w:r>
           </w:p>
         </w:tc>
@@ -9463,7 +9497,7 @@
                 <w:rFonts w:ascii="Times New Roman" w:hAnsi="Times New Roman"/>
                 <w:sz w:val="20"/>
               </w:rPr>
-              <w:t>Em aberto</w:t>
+              <w:t>Risco aceito</w:t>
             </w:r>
           </w:p>
         </w:tc>
@@ -9589,7 +9623,7 @@
                 <w:rFonts w:ascii="Times New Roman" w:hAnsi="Times New Roman"/>
                 <w:sz w:val="20"/>
               </w:rPr>
-              <w:t>Em aberto</w:t>
+              <w:t>Parcial</w:t>
             </w:r>
           </w:p>
         </w:tc>
@@ -9597,12 +9631,10 @@
       <w:tr>
         <w:tc>
           <w:tcPr>
+            <w:cnfStyle w:val="001000000000" w:firstRow="0" w:lastRow="0" w:firstColumn="1" w:lastColumn="0" w:oddVBand="0" w:evenVBand="0" w:oddHBand="0" w:evenHBand="0" w:firstRowFirstColumn="0" w:firstRowLastColumn="0" w:lastRowFirstColumn="0" w:lastRowLastColumn="0"/>
             <w:tcW w:w="737" w:type="dxa"/>
           </w:tcPr>
           <w:p>
-            <w:pPr>
-              <w:cnfStyle w:val="001000000000" w:firstRow="0" w:lastRow="0" w:firstColumn="1" w:lastColumn="0" w:oddVBand="0" w:evenVBand="0" w:oddHBand="0" w:evenHBand="0" w:firstRowFirstColumn="0" w:firstRowLastColumn="0" w:lastRowFirstColumn="0" w:lastRowLastColumn="0"/>
-            </w:pPr>
             <w:r>
               <w:rPr>
                 <w:rFonts w:ascii="Times New Roman" w:hAnsi="Times New Roman"/>
@@ -9617,6 +9649,9 @@
             <w:tcW w:w="2745" w:type="dxa"/>
           </w:tcPr>
           <w:p>
+            <w:pPr>
+              <w:cnfStyle w:val="000000000000" w:firstRow="0" w:lastRow="0" w:firstColumn="0" w:lastColumn="0" w:oddVBand="0" w:evenVBand="0" w:oddHBand="0" w:evenHBand="0" w:firstRowFirstColumn="0" w:firstRowLastColumn="0" w:lastRowFirstColumn="0" w:lastRowLastColumn="0"/>
+            </w:pPr>
             <w:r>
               <w:rPr>
                 <w:rFonts w:ascii="Times New Roman" w:hAnsi="Times New Roman"/>
@@ -9631,6 +9666,9 @@
             <w:tcW w:w="907" w:type="dxa"/>
           </w:tcPr>
           <w:p>
+            <w:pPr>
+              <w:cnfStyle w:val="000000000000" w:firstRow="0" w:lastRow="0" w:firstColumn="0" w:lastColumn="0" w:oddVBand="0" w:evenVBand="0" w:oddHBand="0" w:evenHBand="0" w:firstRowFirstColumn="0" w:firstRowLastColumn="0" w:lastRowFirstColumn="0" w:lastRowLastColumn="0"/>
+            </w:pPr>
             <w:r>
               <w:rPr>
                 <w:rFonts w:ascii="Times New Roman" w:hAnsi="Times New Roman"/>
@@ -9645,6 +9683,9 @@
             <w:tcW w:w="1587" w:type="dxa"/>
           </w:tcPr>
           <w:p>
+            <w:pPr>
+              <w:cnfStyle w:val="000000000000" w:firstRow="0" w:lastRow="0" w:firstColumn="0" w:lastColumn="0" w:oddVBand="0" w:evenVBand="0" w:oddHBand="0" w:evenHBand="0" w:firstRowFirstColumn="0" w:firstRowLastColumn="0" w:lastRowFirstColumn="0" w:lastRowLastColumn="0"/>
+            </w:pPr>
             <w:r>
               <w:rPr>
                 <w:rFonts w:ascii="Times New Roman" w:hAnsi="Times New Roman"/>
@@ -9659,6 +9700,9 @@
             <w:tcW w:w="1077" w:type="dxa"/>
           </w:tcPr>
           <w:p>
+            <w:pPr>
+              <w:cnfStyle w:val="000000000000" w:firstRow="0" w:lastRow="0" w:firstColumn="0" w:lastColumn="0" w:oddVBand="0" w:evenVBand="0" w:oddHBand="0" w:evenHBand="0" w:firstRowFirstColumn="0" w:firstRowLastColumn="0" w:lastRowFirstColumn="0" w:lastRowLastColumn="0"/>
+            </w:pPr>
             <w:r>
               <w:rPr>
                 <w:rFonts w:ascii="Times New Roman" w:hAnsi="Times New Roman"/>
@@ -9673,6 +9717,9 @@
             <w:tcW w:w="907" w:type="dxa"/>
           </w:tcPr>
           <w:p>
+            <w:pPr>
+              <w:cnfStyle w:val="000000000000" w:firstRow="0" w:lastRow="0" w:firstColumn="0" w:lastColumn="0" w:oddVBand="0" w:evenVBand="0" w:oddHBand="0" w:evenHBand="0" w:firstRowFirstColumn="0" w:firstRowLastColumn="0" w:lastRowFirstColumn="0" w:lastRowLastColumn="0"/>
+            </w:pPr>
             <w:r>
               <w:rPr>
                 <w:rFonts w:ascii="Times New Roman" w:hAnsi="Times New Roman"/>
@@ -9688,6 +9735,7 @@
           </w:tcPr>
           <w:p>
             <w:pPr>
+              <w:cnfStyle w:val="000000000000" w:firstRow="0" w:lastRow="0" w:firstColumn="0" w:lastColumn="0" w:oddVBand="0" w:evenVBand="0" w:oddHBand="0" w:evenHBand="0" w:firstRowFirstColumn="0" w:firstRowLastColumn="0" w:lastRowFirstColumn="0" w:lastRowLastColumn="0"/>
               <w:rPr>
                 <w:rFonts w:ascii="Times New Roman" w:hAnsi="Times New Roman"/>
                 <w:sz w:val="20"/>
@@ -9832,12 +9880,10 @@
       <w:tr>
         <w:tc>
           <w:tcPr>
+            <w:cnfStyle w:val="001000000000" w:firstRow="0" w:lastRow="0" w:firstColumn="1" w:lastColumn="0" w:oddVBand="0" w:evenVBand="0" w:oddHBand="0" w:evenHBand="0" w:firstRowFirstColumn="0" w:firstRowLastColumn="0" w:lastRowFirstColumn="0" w:lastRowLastColumn="0"/>
             <w:tcW w:w="737" w:type="dxa"/>
           </w:tcPr>
           <w:p>
-            <w:pPr>
-              <w:cnfStyle w:val="001000000000" w:firstRow="0" w:lastRow="0" w:firstColumn="1" w:lastColumn="0" w:oddVBand="0" w:evenVBand="0" w:oddHBand="0" w:evenHBand="0" w:firstRowFirstColumn="0" w:firstRowLastColumn="0" w:lastRowFirstColumn="0" w:lastRowLastColumn="0"/>
-            </w:pPr>
             <w:r>
               <w:rPr>
                 <w:rFonts w:ascii="Times New Roman" w:hAnsi="Times New Roman"/>
@@ -9852,6 +9898,9 @@
             <w:tcW w:w="2745" w:type="dxa"/>
           </w:tcPr>
           <w:p>
+            <w:pPr>
+              <w:cnfStyle w:val="000000000000" w:firstRow="0" w:lastRow="0" w:firstColumn="0" w:lastColumn="0" w:oddVBand="0" w:evenVBand="0" w:oddHBand="0" w:evenHBand="0" w:firstRowFirstColumn="0" w:firstRowLastColumn="0" w:lastRowFirstColumn="0" w:lastRowLastColumn="0"/>
+            </w:pPr>
             <w:r>
               <w:rPr>
                 <w:rFonts w:ascii="Times New Roman" w:hAnsi="Times New Roman"/>
@@ -9866,6 +9915,9 @@
             <w:tcW w:w="907" w:type="dxa"/>
           </w:tcPr>
           <w:p>
+            <w:pPr>
+              <w:cnfStyle w:val="000000000000" w:firstRow="0" w:lastRow="0" w:firstColumn="0" w:lastColumn="0" w:oddVBand="0" w:evenVBand="0" w:oddHBand="0" w:evenHBand="0" w:firstRowFirstColumn="0" w:firstRowLastColumn="0" w:lastRowFirstColumn="0" w:lastRowLastColumn="0"/>
+            </w:pPr>
             <w:r>
               <w:rPr>
                 <w:rFonts w:ascii="Times New Roman" w:hAnsi="Times New Roman"/>
@@ -9880,6 +9932,9 @@
             <w:tcW w:w="1587" w:type="dxa"/>
           </w:tcPr>
           <w:p>
+            <w:pPr>
+              <w:cnfStyle w:val="000000000000" w:firstRow="0" w:lastRow="0" w:firstColumn="0" w:lastColumn="0" w:oddVBand="0" w:evenVBand="0" w:oddHBand="0" w:evenHBand="0" w:firstRowFirstColumn="0" w:firstRowLastColumn="0" w:lastRowFirstColumn="0" w:lastRowLastColumn="0"/>
+            </w:pPr>
             <w:r>
               <w:rPr>
                 <w:rFonts w:ascii="Times New Roman" w:hAnsi="Times New Roman"/>
@@ -9894,6 +9949,9 @@
             <w:tcW w:w="1077" w:type="dxa"/>
           </w:tcPr>
           <w:p>
+            <w:pPr>
+              <w:cnfStyle w:val="000000000000" w:firstRow="0" w:lastRow="0" w:firstColumn="0" w:lastColumn="0" w:oddVBand="0" w:evenVBand="0" w:oddHBand="0" w:evenHBand="0" w:firstRowFirstColumn="0" w:firstRowLastColumn="0" w:lastRowFirstColumn="0" w:lastRowLastColumn="0"/>
+            </w:pPr>
             <w:r>
               <w:rPr>
                 <w:rFonts w:ascii="Times New Roman" w:hAnsi="Times New Roman"/>
@@ -9908,6 +9966,9 @@
             <w:tcW w:w="907" w:type="dxa"/>
           </w:tcPr>
           <w:p>
+            <w:pPr>
+              <w:cnfStyle w:val="000000000000" w:firstRow="0" w:lastRow="0" w:firstColumn="0" w:lastColumn="0" w:oddVBand="0" w:evenVBand="0" w:oddHBand="0" w:evenHBand="0" w:firstRowFirstColumn="0" w:firstRowLastColumn="0" w:lastRowFirstColumn="0" w:lastRowLastColumn="0"/>
+            </w:pPr>
             <w:r>
               <w:rPr>
                 <w:rFonts w:ascii="Times New Roman" w:hAnsi="Times New Roman"/>
@@ -9923,6 +9984,7 @@
           </w:tcPr>
           <w:p>
             <w:pPr>
+              <w:cnfStyle w:val="000000000000" w:firstRow="0" w:lastRow="0" w:firstColumn="0" w:lastColumn="0" w:oddVBand="0" w:evenVBand="0" w:oddHBand="0" w:evenHBand="0" w:firstRowFirstColumn="0" w:firstRowLastColumn="0" w:lastRowFirstColumn="0" w:lastRowLastColumn="0"/>
               <w:rPr>
                 <w:rFonts w:ascii="Times New Roman" w:hAnsi="Times New Roman"/>
                 <w:sz w:val="20"/>
@@ -10079,6 +10141,22 @@
     </w:p>
     <w:p>
       <w:pPr>
+        <w:widowControl w:val="0"/>
+        <w:jc w:val="both"/>
+        <w:rPr>
+          <w:rFonts w:ascii="Times New Roman" w:eastAsia="Times New Roman" w:hAnsi="Times New Roman" w:cs="Times New Roman"/>
+        </w:rPr>
+      </w:pPr>
+      <w:bookmarkStart w:id="18" w:name="_Toc243240766"/>
+      <w:r>
+        <w:rPr>
+          <w:rFonts w:ascii="Times New Roman" w:eastAsia="Times New Roman" w:hAnsi="Times New Roman" w:cs="Times New Roman"/>
+        </w:rPr>
+        <w:t>Aceitação formal do risco R10. O registro dos materiais guardados (MaterialSalvo) indica interesse por um tema de saúde e é dado pessoal sensível, mas fica no banco sem cifragem própria da aplicação. A equipe aceita esse risco residual pelos seguintes motivos: o registro guarda apenas qual material e quando, sem nenhuma anotação da pessoa; só é gravado com consentimento específico para essa finalidade, que pode ser revogado a qualquer momento e apaga os registros; o banco só é acessado por conexão cifrada que confere o certificado e o nome do servidor; e o disco do serviço é cifrado pelo próprio Aiven, que usa cifragem de volume completo (LUKS) com uma chave aleatória por instância e também cifra os backups (AIVEN, 2026). Cifrar o campo na aplicação impediria as consultas que listam e removem os materiais de cada conta, com ganho pequeno diante dessas proteções. Os endereços IP da trilha de auditoria seguem a mesma decisão: precisam ser legíveis para a análise de incidentes e são apagados depois do prazo de retenção de seis meses. O risco será reavaliado se a função passar a guardar mais do que o material e a data.</w:t>
+      </w:r>
+    </w:p>
+    <w:p>
+      <w:pPr>
         <w:pStyle w:val="Ttulo2"/>
         <w:widowControl w:val="0"/>
         <w:spacing w:line="360" w:lineRule="auto"/>
@@ -10091,7 +10169,6 @@
           <w:szCs w:val="24"/>
         </w:rPr>
       </w:pPr>
-      <w:bookmarkStart w:id="18" w:name="_Toc243240766"/>
       <w:r>
         <w:rPr>
           <w:rFonts w:ascii="Times New Roman" w:eastAsia="Times New Roman" w:hAnsi="Times New Roman" w:cs="Times New Roman"/>
@@ -12508,7 +12585,7 @@
           <w:noProof/>
         </w:rPr>
         <w:drawing>
-          <wp:inline distT="0" distB="0" distL="0" distR="0" wp14:anchorId="5F13D73D" wp14:editId="79896915">
+          <wp:inline distT="0" distB="0" distL="0" distR="0" wp14:anchorId="5F13D73D" wp14:editId="398EC435">
             <wp:extent cx="5762625" cy="2737422"/>
             <wp:effectExtent l="0" t="0" r="0" b="6350"/>
             <wp:docPr id="859284772" name="Imagem 3"/>
@@ -12727,7 +12804,7 @@
         <w:rPr>
           <w:rFonts w:ascii="Times New Roman" w:eastAsia="Times New Roman" w:hAnsi="Times New Roman" w:cs="Times New Roman"/>
         </w:rPr>
-        <w:t>a suíte de testes automatizados soma 146 testes</w:t>
+        <w:t>a suíte de testes automatizados soma 162 testes</w:t>
       </w:r>
       <w:r>
         <w:rPr>
@@ -12842,7 +12919,7 @@
         <w:rPr>
           <w:rFonts w:ascii="Times New Roman" w:eastAsia="Times New Roman" w:hAnsi="Times New Roman"/>
         </w:rPr>
-        <w:t>assim como o tratamento dos riscos que seguem em aberto na matriz da seção 3.5, entre eles os de nível Alto R02 e R04 e a conclusão do R03.</w:t>
+        <w:t>assim como o R06 e a parte dos riscos R02, R03, R04 e R11 que depende de configuração nos painéis do Render, do Aiven e do GitHub, descrita no roteiro de operação do repositório (docs/operacao.md).</w:t>
       </w:r>
     </w:p>
     <w:p>
@@ -12858,6 +12935,14 @@
         <w:t>REFERÊNCIAS</w:t>
       </w:r>
       <w:bookmarkEnd w:id="42"/>
+    </w:p>
+    <w:p>
+      <w:r>
+        <w:rPr>
+          <w:rFonts w:ascii="Times New Roman" w:eastAsia="Times New Roman" w:hAnsi="Times New Roman"/>
+        </w:rPr>
+        <w:t>AIVEN. Cloud security. [S. l.]: Aiven, 2026. Disponível em: https://aiven.io/docs/platform/concepts/cloud-security. Acesso em: 20 out. 2026.</w:t>
+      </w:r>
     </w:p>
     <w:p>
       <w:r>

</xml_diff>

<commit_message>
marca o R03 e o R11 como corrigidos na documentação
</commit_message>
<xml_diff>
--- a/docs/Health-In-Sight-Documentacao-Tecnico-Cientifica.docx
+++ b/docs/Health-In-Sight-Documentacao-Tecnico-Cientifica.docx
@@ -8048,7 +8048,13 @@
               <w:rPr>
                 <w:rFonts w:ascii="Times New Roman" w:eastAsia="Times New Roman" w:hAnsi="Times New Roman"/>
               </w:rPr>
-              <w:t>Os mesmos limites por IP e no total reduzem quantos Argon2id são calculados ao mesmo tempo. Falta subir 2 workers no Gunicorn (WEB_CONCURRENCY no Render).</w:t>
+              <w:t xml:space="preserve">Os mesmos limites por IP e no total reduzem quantos Argon2id são calculados ao mesmo tempo. </w:t>
+            </w:r>
+            <w:r>
+              <w:rPr>
+                <w:rFonts w:ascii="Times New Roman" w:eastAsia="Times New Roman" w:hAnsi="Times New Roman"/>
+              </w:rPr>
+              <w:t>O Gunicorn roda com 2 workers (WEB_CONCURRENCY no Render).</w:t>
             </w:r>
           </w:p>
         </w:tc>
@@ -8428,12 +8434,10 @@
       <w:tr>
         <w:tc>
           <w:tcPr>
+            <w:cnfStyle w:val="001000000000" w:firstRow="0" w:lastRow="0" w:firstColumn="1" w:lastColumn="0" w:oddVBand="0" w:evenVBand="0" w:oddHBand="0" w:evenHBand="0" w:firstRowFirstColumn="0" w:firstRowLastColumn="0" w:lastRowFirstColumn="0" w:lastRowLastColumn="0"/>
             <w:tcW w:w="737" w:type="dxa"/>
           </w:tcPr>
           <w:p>
-            <w:pPr>
-              <w:cnfStyle w:val="001000000000" w:firstRow="0" w:lastRow="0" w:firstColumn="1" w:lastColumn="0" w:oddVBand="0" w:evenVBand="0" w:oddHBand="0" w:evenHBand="0" w:firstRowFirstColumn="0" w:firstRowLastColumn="0" w:lastRowFirstColumn="0" w:lastRowLastColumn="0"/>
-            </w:pPr>
             <w:r>
               <w:rPr>
                 <w:rFonts w:ascii="Times New Roman" w:hAnsi="Times New Roman"/>
@@ -8448,6 +8452,9 @@
             <w:tcW w:w="2745" w:type="dxa"/>
           </w:tcPr>
           <w:p>
+            <w:pPr>
+              <w:cnfStyle w:val="000000000000" w:firstRow="0" w:lastRow="0" w:firstColumn="0" w:lastColumn="0" w:oddVBand="0" w:evenVBand="0" w:oddHBand="0" w:evenHBand="0" w:firstRowFirstColumn="0" w:firstRowLastColumn="0" w:lastRowFirstColumn="0" w:lastRowLastColumn="0"/>
+            </w:pPr>
             <w:r>
               <w:rPr>
                 <w:rFonts w:ascii="Times New Roman" w:hAnsi="Times New Roman"/>
@@ -8462,6 +8469,9 @@
             <w:tcW w:w="907" w:type="dxa"/>
           </w:tcPr>
           <w:p>
+            <w:pPr>
+              <w:cnfStyle w:val="000000000000" w:firstRow="0" w:lastRow="0" w:firstColumn="0" w:lastColumn="0" w:oddVBand="0" w:evenVBand="0" w:oddHBand="0" w:evenHBand="0" w:firstRowFirstColumn="0" w:firstRowLastColumn="0" w:lastRowFirstColumn="0" w:lastRowLastColumn="0"/>
+            </w:pPr>
             <w:r>
               <w:rPr>
                 <w:rFonts w:ascii="Times New Roman" w:hAnsi="Times New Roman"/>
@@ -8476,6 +8486,9 @@
             <w:tcW w:w="1587" w:type="dxa"/>
           </w:tcPr>
           <w:p>
+            <w:pPr>
+              <w:cnfStyle w:val="000000000000" w:firstRow="0" w:lastRow="0" w:firstColumn="0" w:lastColumn="0" w:oddVBand="0" w:evenVBand="0" w:oddHBand="0" w:evenHBand="0" w:firstRowFirstColumn="0" w:firstRowLastColumn="0" w:lastRowFirstColumn="0" w:lastRowLastColumn="0"/>
+            </w:pPr>
             <w:r>
               <w:rPr>
                 <w:rFonts w:ascii="Times New Roman" w:hAnsi="Times New Roman"/>
@@ -8490,6 +8503,9 @@
             <w:tcW w:w="1077" w:type="dxa"/>
           </w:tcPr>
           <w:p>
+            <w:pPr>
+              <w:cnfStyle w:val="000000000000" w:firstRow="0" w:lastRow="0" w:firstColumn="0" w:lastColumn="0" w:oddVBand="0" w:evenVBand="0" w:oddHBand="0" w:evenHBand="0" w:firstRowFirstColumn="0" w:firstRowLastColumn="0" w:lastRowFirstColumn="0" w:lastRowLastColumn="0"/>
+            </w:pPr>
             <w:r>
               <w:rPr>
                 <w:rFonts w:ascii="Times New Roman" w:hAnsi="Times New Roman"/>
@@ -8504,6 +8520,9 @@
             <w:tcW w:w="907" w:type="dxa"/>
           </w:tcPr>
           <w:p>
+            <w:pPr>
+              <w:cnfStyle w:val="000000000000" w:firstRow="0" w:lastRow="0" w:firstColumn="0" w:lastColumn="0" w:oddVBand="0" w:evenVBand="0" w:oddHBand="0" w:evenHBand="0" w:firstRowFirstColumn="0" w:firstRowLastColumn="0" w:lastRowFirstColumn="0" w:lastRowLastColumn="0"/>
+            </w:pPr>
             <w:r>
               <w:rPr>
                 <w:rFonts w:ascii="Times New Roman" w:hAnsi="Times New Roman"/>
@@ -8519,6 +8538,7 @@
           </w:tcPr>
           <w:p>
             <w:pPr>
+              <w:cnfStyle w:val="000000000000" w:firstRow="0" w:lastRow="0" w:firstColumn="0" w:lastColumn="0" w:oddVBand="0" w:evenVBand="0" w:oddHBand="0" w:evenHBand="0" w:firstRowFirstColumn="0" w:firstRowLastColumn="0" w:lastRowFirstColumn="0" w:lastRowLastColumn="0"/>
               <w:rPr>
                 <w:rFonts w:ascii="Times New Roman" w:hAnsi="Times New Roman"/>
                 <w:sz w:val="20"/>
@@ -8655,7 +8675,7 @@
                 <w:rFonts w:ascii="Times New Roman" w:hAnsi="Times New Roman"/>
                 <w:sz w:val="20"/>
               </w:rPr>
-              <w:t>Parcial</w:t>
+              <w:t>Corrigido</w:t>
             </w:r>
           </w:p>
         </w:tc>
@@ -8663,12 +8683,10 @@
       <w:tr>
         <w:tc>
           <w:tcPr>
+            <w:cnfStyle w:val="001000000000" w:firstRow="0" w:lastRow="0" w:firstColumn="1" w:lastColumn="0" w:oddVBand="0" w:evenVBand="0" w:oddHBand="0" w:evenHBand="0" w:firstRowFirstColumn="0" w:firstRowLastColumn="0" w:lastRowFirstColumn="0" w:lastRowLastColumn="0"/>
             <w:tcW w:w="737" w:type="dxa"/>
           </w:tcPr>
           <w:p>
-            <w:pPr>
-              <w:cnfStyle w:val="001000000000" w:firstRow="0" w:lastRow="0" w:firstColumn="1" w:lastColumn="0" w:oddVBand="0" w:evenVBand="0" w:oddHBand="0" w:evenHBand="0" w:firstRowFirstColumn="0" w:firstRowLastColumn="0" w:lastRowFirstColumn="0" w:lastRowLastColumn="0"/>
-            </w:pPr>
             <w:r>
               <w:rPr>
                 <w:rFonts w:ascii="Times New Roman" w:hAnsi="Times New Roman"/>
@@ -8683,6 +8701,9 @@
             <w:tcW w:w="2745" w:type="dxa"/>
           </w:tcPr>
           <w:p>
+            <w:pPr>
+              <w:cnfStyle w:val="000000000000" w:firstRow="0" w:lastRow="0" w:firstColumn="0" w:lastColumn="0" w:oddVBand="0" w:evenVBand="0" w:oddHBand="0" w:evenHBand="0" w:firstRowFirstColumn="0" w:firstRowLastColumn="0" w:lastRowFirstColumn="0" w:lastRowLastColumn="0"/>
+            </w:pPr>
             <w:r>
               <w:rPr>
                 <w:rFonts w:ascii="Times New Roman" w:hAnsi="Times New Roman"/>
@@ -8697,6 +8718,9 @@
             <w:tcW w:w="907" w:type="dxa"/>
           </w:tcPr>
           <w:p>
+            <w:pPr>
+              <w:cnfStyle w:val="000000000000" w:firstRow="0" w:lastRow="0" w:firstColumn="0" w:lastColumn="0" w:oddVBand="0" w:evenVBand="0" w:oddHBand="0" w:evenHBand="0" w:firstRowFirstColumn="0" w:firstRowLastColumn="0" w:lastRowFirstColumn="0" w:lastRowLastColumn="0"/>
+            </w:pPr>
             <w:r>
               <w:rPr>
                 <w:rFonts w:ascii="Times New Roman" w:hAnsi="Times New Roman"/>
@@ -8711,6 +8735,9 @@
             <w:tcW w:w="1587" w:type="dxa"/>
           </w:tcPr>
           <w:p>
+            <w:pPr>
+              <w:cnfStyle w:val="000000000000" w:firstRow="0" w:lastRow="0" w:firstColumn="0" w:lastColumn="0" w:oddVBand="0" w:evenVBand="0" w:oddHBand="0" w:evenHBand="0" w:firstRowFirstColumn="0" w:firstRowLastColumn="0" w:lastRowFirstColumn="0" w:lastRowLastColumn="0"/>
+            </w:pPr>
             <w:r>
               <w:rPr>
                 <w:rFonts w:ascii="Times New Roman" w:hAnsi="Times New Roman"/>
@@ -8725,6 +8752,9 @@
             <w:tcW w:w="1077" w:type="dxa"/>
           </w:tcPr>
           <w:p>
+            <w:pPr>
+              <w:cnfStyle w:val="000000000000" w:firstRow="0" w:lastRow="0" w:firstColumn="0" w:lastColumn="0" w:oddVBand="0" w:evenVBand="0" w:oddHBand="0" w:evenHBand="0" w:firstRowFirstColumn="0" w:firstRowLastColumn="0" w:lastRowFirstColumn="0" w:lastRowLastColumn="0"/>
+            </w:pPr>
             <w:r>
               <w:rPr>
                 <w:rFonts w:ascii="Times New Roman" w:hAnsi="Times New Roman"/>
@@ -8739,6 +8769,9 @@
             <w:tcW w:w="907" w:type="dxa"/>
           </w:tcPr>
           <w:p>
+            <w:pPr>
+              <w:cnfStyle w:val="000000000000" w:firstRow="0" w:lastRow="0" w:firstColumn="0" w:lastColumn="0" w:oddVBand="0" w:evenVBand="0" w:oddHBand="0" w:evenHBand="0" w:firstRowFirstColumn="0" w:firstRowLastColumn="0" w:lastRowFirstColumn="0" w:lastRowLastColumn="0"/>
+            </w:pPr>
             <w:r>
               <w:rPr>
                 <w:rFonts w:ascii="Times New Roman" w:hAnsi="Times New Roman"/>
@@ -8754,6 +8787,7 @@
           </w:tcPr>
           <w:p>
             <w:pPr>
+              <w:cnfStyle w:val="000000000000" w:firstRow="0" w:lastRow="0" w:firstColumn="0" w:lastColumn="0" w:oddVBand="0" w:evenVBand="0" w:oddHBand="0" w:evenHBand="0" w:firstRowFirstColumn="0" w:firstRowLastColumn="0" w:lastRowFirstColumn="0" w:lastRowLastColumn="0"/>
               <w:rPr>
                 <w:rFonts w:ascii="Times New Roman" w:hAnsi="Times New Roman"/>
                 <w:sz w:val="20"/>
@@ -9396,12 +9430,10 @@
       <w:tr>
         <w:tc>
           <w:tcPr>
+            <w:cnfStyle w:val="001000000000" w:firstRow="0" w:lastRow="0" w:firstColumn="1" w:lastColumn="0" w:oddVBand="0" w:evenVBand="0" w:oddHBand="0" w:evenHBand="0" w:firstRowFirstColumn="0" w:firstRowLastColumn="0" w:lastRowFirstColumn="0" w:lastRowLastColumn="0"/>
             <w:tcW w:w="737" w:type="dxa"/>
           </w:tcPr>
           <w:p>
-            <w:pPr>
-              <w:cnfStyle w:val="001000000000" w:firstRow="0" w:lastRow="0" w:firstColumn="1" w:lastColumn="0" w:oddVBand="0" w:evenVBand="0" w:oddHBand="0" w:evenHBand="0" w:firstRowFirstColumn="0" w:firstRowLastColumn="0" w:lastRowFirstColumn="0" w:lastRowLastColumn="0"/>
-            </w:pPr>
             <w:r>
               <w:rPr>
                 <w:rFonts w:ascii="Times New Roman" w:hAnsi="Times New Roman"/>
@@ -9416,6 +9448,9 @@
             <w:tcW w:w="2745" w:type="dxa"/>
           </w:tcPr>
           <w:p>
+            <w:pPr>
+              <w:cnfStyle w:val="000000000000" w:firstRow="0" w:lastRow="0" w:firstColumn="0" w:lastColumn="0" w:oddVBand="0" w:evenVBand="0" w:oddHBand="0" w:evenHBand="0" w:firstRowFirstColumn="0" w:firstRowLastColumn="0" w:lastRowFirstColumn="0" w:lastRowLastColumn="0"/>
+            </w:pPr>
             <w:r>
               <w:rPr>
                 <w:rFonts w:ascii="Times New Roman" w:hAnsi="Times New Roman"/>
@@ -9430,6 +9465,9 @@
             <w:tcW w:w="907" w:type="dxa"/>
           </w:tcPr>
           <w:p>
+            <w:pPr>
+              <w:cnfStyle w:val="000000000000" w:firstRow="0" w:lastRow="0" w:firstColumn="0" w:lastColumn="0" w:oddVBand="0" w:evenVBand="0" w:oddHBand="0" w:evenHBand="0" w:firstRowFirstColumn="0" w:firstRowLastColumn="0" w:lastRowFirstColumn="0" w:lastRowLastColumn="0"/>
+            </w:pPr>
             <w:r>
               <w:rPr>
                 <w:rFonts w:ascii="Times New Roman" w:hAnsi="Times New Roman"/>
@@ -9444,6 +9482,9 @@
             <w:tcW w:w="1587" w:type="dxa"/>
           </w:tcPr>
           <w:p>
+            <w:pPr>
+              <w:cnfStyle w:val="000000000000" w:firstRow="0" w:lastRow="0" w:firstColumn="0" w:lastColumn="0" w:oddVBand="0" w:evenVBand="0" w:oddHBand="0" w:evenHBand="0" w:firstRowFirstColumn="0" w:firstRowLastColumn="0" w:lastRowFirstColumn="0" w:lastRowLastColumn="0"/>
+            </w:pPr>
             <w:r>
               <w:rPr>
                 <w:rFonts w:ascii="Times New Roman" w:hAnsi="Times New Roman"/>
@@ -9458,6 +9499,9 @@
             <w:tcW w:w="1077" w:type="dxa"/>
           </w:tcPr>
           <w:p>
+            <w:pPr>
+              <w:cnfStyle w:val="000000000000" w:firstRow="0" w:lastRow="0" w:firstColumn="0" w:lastColumn="0" w:oddVBand="0" w:evenVBand="0" w:oddHBand="0" w:evenHBand="0" w:firstRowFirstColumn="0" w:firstRowLastColumn="0" w:lastRowFirstColumn="0" w:lastRowLastColumn="0"/>
+            </w:pPr>
             <w:r>
               <w:rPr>
                 <w:rFonts w:ascii="Times New Roman" w:hAnsi="Times New Roman"/>
@@ -9472,6 +9516,9 @@
             <w:tcW w:w="907" w:type="dxa"/>
           </w:tcPr>
           <w:p>
+            <w:pPr>
+              <w:cnfStyle w:val="000000000000" w:firstRow="0" w:lastRow="0" w:firstColumn="0" w:lastColumn="0" w:oddVBand="0" w:evenVBand="0" w:oddHBand="0" w:evenHBand="0" w:firstRowFirstColumn="0" w:firstRowLastColumn="0" w:lastRowFirstColumn="0" w:lastRowLastColumn="0"/>
+            </w:pPr>
             <w:r>
               <w:rPr>
                 <w:rFonts w:ascii="Times New Roman" w:hAnsi="Times New Roman"/>
@@ -9487,6 +9534,7 @@
           </w:tcPr>
           <w:p>
             <w:pPr>
+              <w:cnfStyle w:val="000000000000" w:firstRow="0" w:lastRow="0" w:firstColumn="0" w:lastColumn="0" w:oddVBand="0" w:evenVBand="0" w:oddHBand="0" w:evenHBand="0" w:firstRowFirstColumn="0" w:firstRowLastColumn="0" w:lastRowFirstColumn="0" w:lastRowLastColumn="0"/>
               <w:rPr>
                 <w:rFonts w:ascii="Times New Roman" w:hAnsi="Times New Roman"/>
                 <w:sz w:val="20"/>
@@ -9623,7 +9671,7 @@
                 <w:rFonts w:ascii="Times New Roman" w:hAnsi="Times New Roman"/>
                 <w:sz w:val="20"/>
               </w:rPr>
-              <w:t>Parcial</w:t>
+              <w:t>Corrigido</w:t>
             </w:r>
           </w:p>
         </w:tc>
@@ -12585,7 +12633,7 @@
           <w:noProof/>
         </w:rPr>
         <w:drawing>
-          <wp:inline distT="0" distB="0" distL="0" distR="0" wp14:anchorId="5F13D73D" wp14:editId="398EC435">
+          <wp:inline distT="0" distB="0" distL="0" distR="0" wp14:anchorId="5F13D73D" wp14:editId="7B1FFC2A">
             <wp:extent cx="5762625" cy="2737422"/>
             <wp:effectExtent l="0" t="0" r="0" b="6350"/>
             <wp:docPr id="859284772" name="Imagem 3"/>
@@ -12919,7 +12967,13 @@
         <w:rPr>
           <w:rFonts w:ascii="Times New Roman" w:eastAsia="Times New Roman" w:hAnsi="Times New Roman"/>
         </w:rPr>
-        <w:t>assim como o R06 e a parte dos riscos R02, R03, R04 e R11 que depende de configuração nos painéis do Render, do Aiven e do GitHub, descrita no roteiro de operação do repositório (docs/operacao.md).</w:t>
+        <w:t>assim como o R06 e a parte dos riscos R02 e R04 que depende</w:t>
+      </w:r>
+      <w:r>
+        <w:rPr>
+          <w:rFonts w:ascii="Times New Roman" w:eastAsia="Times New Roman" w:hAnsi="Times New Roman"/>
+        </w:rPr>
+        <w:t xml:space="preserve"> de configuração nos painéis do Render, do Aiven e do GitHub, descrita no roteiro de operação do repositório (docs/operacao.md).</w:t>
       </w:r>
     </w:p>
     <w:p>

</xml_diff>

<commit_message>
registra o teste de restauração e marca o R04 como corrigido
</commit_message>
<xml_diff>
--- a/docs/Health-In-Sight-Documentacao-Tecnico-Cientifica.docx
+++ b/docs/Health-In-Sight-Documentacao-Tecnico-Cientifica.docx
@@ -8798,7 +8798,7 @@
                 <w:rFonts w:ascii="Times New Roman" w:hAnsi="Times New Roman"/>
                 <w:sz w:val="20"/>
               </w:rPr>
-              <w:t>Parcial</w:t>
+              <w:t>Corrigido</w:t>
             </w:r>
           </w:p>
         </w:tc>
@@ -12633,7 +12633,7 @@
           <w:noProof/>
         </w:rPr>
         <w:drawing>
-          <wp:inline distT="0" distB="0" distL="0" distR="0" wp14:anchorId="5F13D73D" wp14:editId="7B1FFC2A">
+          <wp:inline distT="0" distB="0" distL="0" distR="0" wp14:anchorId="5F13D73D" wp14:editId="13BF6E86">
             <wp:extent cx="5762625" cy="2737422"/>
             <wp:effectExtent l="0" t="0" r="0" b="6350"/>
             <wp:docPr id="859284772" name="Imagem 3"/>
@@ -12967,13 +12967,13 @@
         <w:rPr>
           <w:rFonts w:ascii="Times New Roman" w:eastAsia="Times New Roman" w:hAnsi="Times New Roman"/>
         </w:rPr>
-        <w:t>assim como o R06 e a parte dos riscos R02 e R04 que depende</w:t>
+        <w:t>assim como o R06 e a parte do risco R02 que depende de configuração nos painéis do Render e do Aiven,</w:t>
       </w:r>
       <w:r>
         <w:rPr>
           <w:rFonts w:ascii="Times New Roman" w:eastAsia="Times New Roman" w:hAnsi="Times New Roman"/>
         </w:rPr>
-        <w:t xml:space="preserve"> de configuração nos painéis do Render, do Aiven e do GitHub, descrita no roteiro de operação do repositório (docs/operacao.md).</w:t>
+        <w:t xml:space="preserve"> descrita no roteiro de operação do repositório (docs/operacao.md).</w:t>
       </w:r>
     </w:p>
     <w:p>

</xml_diff>